<commit_message>
feat(celsis): split Table 2/3 variables into pro_/alq_ prefixes (38+38=76 independent EM variables)
</commit_message>
<xml_diff>
--- a/tables for celsis.docx
+++ b/tables for celsis.docx
@@ -1059,7 +1059,7 @@
                 <w:sz w:val="14"/>
                 <w:szCs w:val="14"/>
               </w:rPr>
-              <w:t>{{ before_test }}</w:t>
+              <w:t w:space="preserve" xml:space="preserve">{{ pro_before_test }}</w:t>
             </w:r>
           </w:p>
         </w:tc>
@@ -1097,7 +1097,7 @@
                 <w:sz w:val="14"/>
                 <w:szCs w:val="14"/>
               </w:rPr>
-              <w:t>{{ analyst_initial }}</w:t>
+              <w:t w:space="preserve" xml:space="preserve">{{ pro_analyst_initial }}</w:t>
             </w:r>
           </w:p>
         </w:tc>
@@ -1166,7 +1166,7 @@
                 <w:sz w:val="14"/>
                 <w:szCs w:val="14"/>
               </w:rPr>
-              <w:t>{{ be_obs_pers_dur_pro }}</w:t>
+              <w:t w:space="preserve" xml:space="preserve">{{ pro_be_obs_pers_dur_pro }}</w:t>
             </w:r>
           </w:p>
         </w:tc>
@@ -1194,43 +1194,43 @@
                 <w:sz w:val="14"/>
                 <w:szCs w:val="14"/>
               </w:rPr>
-              <w:t xml:space="preserve">{{ </w:t>
-            </w:r>
-            <w:r>
-              <w:rPr>
-                <w:rFonts w:ascii="Times New Roman" w:hAnsi="Times New Roman"/>
-                <w:color w:val="000000" w:themeColor="text1"/>
-                <w:sz w:val="14"/>
-                <w:szCs w:val="14"/>
-              </w:rPr>
-              <w:t>be_</w:t>
-            </w:r>
-            <w:r>
-              <w:rPr>
-                <w:rFonts w:ascii="Times New Roman" w:hAnsi="Times New Roman"/>
-                <w:color w:val="000000" w:themeColor="text1"/>
-                <w:sz w:val="14"/>
-                <w:szCs w:val="14"/>
-              </w:rPr>
-              <w:t>etx_pers_dur</w:t>
-            </w:r>
-            <w:r>
-              <w:rPr>
-                <w:rFonts w:ascii="Times New Roman" w:hAnsi="Times New Roman"/>
-                <w:color w:val="000000" w:themeColor="text1"/>
-                <w:sz w:val="14"/>
-                <w:szCs w:val="14"/>
-              </w:rPr>
-              <w:t>_pro</w:t>
-            </w:r>
-            <w:r>
-              <w:rPr>
-                <w:rFonts w:ascii="Times New Roman" w:hAnsi="Times New Roman"/>
-                <w:color w:val="000000" w:themeColor="text1"/>
-                <w:sz w:val="14"/>
-                <w:szCs w:val="14"/>
-              </w:rPr>
-              <w:t xml:space="preserve"> }}</w:t>
+              <w:t xml:space="preserve" w:space="preserve">{{ pro_be_etx_pers_dur_pro }}</w:t>
+            </w:r>
+            <w:r>
+              <w:rPr>
+                <w:rFonts w:ascii="Times New Roman" w:hAnsi="Times New Roman"/>
+                <w:color w:val="000000" w:themeColor="text1"/>
+                <w:sz w:val="14"/>
+                <w:szCs w:val="14"/>
+              </w:rPr>
+              <w:t/>
+            </w:r>
+            <w:r>
+              <w:rPr>
+                <w:rFonts w:ascii="Times New Roman" w:hAnsi="Times New Roman"/>
+                <w:color w:val="000000" w:themeColor="text1"/>
+                <w:sz w:val="14"/>
+                <w:szCs w:val="14"/>
+              </w:rPr>
+              <w:t/>
+            </w:r>
+            <w:r>
+              <w:rPr>
+                <w:rFonts w:ascii="Times New Roman" w:hAnsi="Times New Roman"/>
+                <w:color w:val="000000" w:themeColor="text1"/>
+                <w:sz w:val="14"/>
+                <w:szCs w:val="14"/>
+              </w:rPr>
+              <w:t/>
+            </w:r>
+            <w:r>
+              <w:rPr>
+                <w:rFonts w:ascii="Times New Roman" w:hAnsi="Times New Roman"/>
+                <w:color w:val="000000" w:themeColor="text1"/>
+                <w:sz w:val="14"/>
+                <w:szCs w:val="14"/>
+              </w:rPr>
+              <w:t xml:space="preserve"/>
             </w:r>
           </w:p>
         </w:tc>
@@ -1258,43 +1258,43 @@
                 <w:sz w:val="14"/>
                 <w:szCs w:val="14"/>
               </w:rPr>
-              <w:t xml:space="preserve">{{ </w:t>
-            </w:r>
-            <w:r>
-              <w:rPr>
-                <w:rFonts w:ascii="Times New Roman" w:hAnsi="Times New Roman"/>
-                <w:color w:val="000000" w:themeColor="text1"/>
-                <w:sz w:val="14"/>
-                <w:szCs w:val="14"/>
-              </w:rPr>
-              <w:t>be_</w:t>
-            </w:r>
-            <w:r>
-              <w:rPr>
-                <w:rFonts w:ascii="Times New Roman" w:hAnsi="Times New Roman"/>
-                <w:color w:val="000000" w:themeColor="text1"/>
-                <w:sz w:val="14"/>
-                <w:szCs w:val="14"/>
-              </w:rPr>
-              <w:t>id_pers_dur</w:t>
-            </w:r>
-            <w:r>
-              <w:rPr>
-                <w:rFonts w:ascii="Times New Roman" w:hAnsi="Times New Roman"/>
-                <w:color w:val="000000" w:themeColor="text1"/>
-                <w:sz w:val="14"/>
-                <w:szCs w:val="14"/>
-              </w:rPr>
-              <w:t>_pro</w:t>
-            </w:r>
-            <w:r>
-              <w:rPr>
-                <w:rFonts w:ascii="Times New Roman" w:hAnsi="Times New Roman"/>
-                <w:color w:val="000000" w:themeColor="text1"/>
-                <w:sz w:val="14"/>
-                <w:szCs w:val="14"/>
-              </w:rPr>
-              <w:t xml:space="preserve"> }}</w:t>
+              <w:t xml:space="preserve" w:space="preserve">{{ pro_be_id_pers_dur_pro }}</w:t>
+            </w:r>
+            <w:r>
+              <w:rPr>
+                <w:rFonts w:ascii="Times New Roman" w:hAnsi="Times New Roman"/>
+                <w:color w:val="000000" w:themeColor="text1"/>
+                <w:sz w:val="14"/>
+                <w:szCs w:val="14"/>
+              </w:rPr>
+              <w:t/>
+            </w:r>
+            <w:r>
+              <w:rPr>
+                <w:rFonts w:ascii="Times New Roman" w:hAnsi="Times New Roman"/>
+                <w:color w:val="000000" w:themeColor="text1"/>
+                <w:sz w:val="14"/>
+                <w:szCs w:val="14"/>
+              </w:rPr>
+              <w:t/>
+            </w:r>
+            <w:r>
+              <w:rPr>
+                <w:rFonts w:ascii="Times New Roman" w:hAnsi="Times New Roman"/>
+                <w:color w:val="000000" w:themeColor="text1"/>
+                <w:sz w:val="14"/>
+                <w:szCs w:val="14"/>
+              </w:rPr>
+              <w:t/>
+            </w:r>
+            <w:r>
+              <w:rPr>
+                <w:rFonts w:ascii="Times New Roman" w:hAnsi="Times New Roman"/>
+                <w:color w:val="000000" w:themeColor="text1"/>
+                <w:sz w:val="14"/>
+                <w:szCs w:val="14"/>
+              </w:rPr>
+              <w:t xml:space="preserve"/>
             </w:r>
           </w:p>
         </w:tc>
@@ -1437,16 +1437,16 @@
                 <w:sz w:val="14"/>
                 <w:szCs w:val="14"/>
               </w:rPr>
-              <w:t xml:space="preserve"> </w:t>
-            </w:r>
-            <w:r>
-              <w:rPr>
-                <w:rFonts w:ascii="Times New Roman" w:hAnsi="Times New Roman"/>
-                <w:color w:val="000000" w:themeColor="text1"/>
-                <w:sz w:val="14"/>
-                <w:szCs w:val="14"/>
-              </w:rPr>
-              <w:t>{{ test_date }}</w:t>
+              <w:t xml:space="preserve" w:space="preserve"> {{ pro_test_date }}</w:t>
+            </w:r>
+            <w:r>
+              <w:rPr>
+                <w:rFonts w:ascii="Times New Roman" w:hAnsi="Times New Roman"/>
+                <w:color w:val="000000" w:themeColor="text1"/>
+                <w:sz w:val="14"/>
+                <w:szCs w:val="14"/>
+              </w:rPr>
+              <w:t/>
             </w:r>
           </w:p>
         </w:tc>
@@ -1485,16 +1485,16 @@
                 <w:sz w:val="14"/>
                 <w:szCs w:val="14"/>
               </w:rPr>
-              <w:t>{{ analyst_initial }}</w:t>
-            </w:r>
-            <w:r>
-              <w:rPr>
-                <w:rFonts w:ascii="Times New Roman" w:hAnsi="Times New Roman"/>
-                <w:color w:val="000000" w:themeColor="text1"/>
-                <w:sz w:val="14"/>
-                <w:szCs w:val="14"/>
-              </w:rPr>
-              <w:t xml:space="preserve"> </w:t>
+              <w:t w:space="preserve" xml:space="preserve">{{ pro_analyst_initial }} </w:t>
+            </w:r>
+            <w:r>
+              <w:rPr>
+                <w:rFonts w:ascii="Times New Roman" w:hAnsi="Times New Roman"/>
+                <w:color w:val="000000" w:themeColor="text1"/>
+                <w:sz w:val="14"/>
+                <w:szCs w:val="14"/>
+              </w:rPr>
+              <w:t xml:space="preserve"/>
             </w:r>
             <w:bookmarkEnd w:id="0"/>
           </w:p>
@@ -1564,7 +1564,7 @@
                 <w:sz w:val="14"/>
                 <w:szCs w:val="14"/>
               </w:rPr>
-              <w:t>{{ obs_pers_dur_pro }}</w:t>
+              <w:t w:space="preserve" xml:space="preserve">{{ pro_obs_pers_dur_pro }}</w:t>
             </w:r>
           </w:p>
         </w:tc>
@@ -1600,25 +1600,25 @@
                 <w:sz w:val="14"/>
                 <w:szCs w:val="14"/>
               </w:rPr>
-              <w:t>{{ etx_pers_dur</w:t>
-            </w:r>
-            <w:r>
-              <w:rPr>
-                <w:rFonts w:ascii="Times New Roman" w:hAnsi="Times New Roman"/>
-                <w:color w:val="000000" w:themeColor="text1"/>
-                <w:sz w:val="14"/>
-                <w:szCs w:val="14"/>
-              </w:rPr>
-              <w:t>_pro</w:t>
-            </w:r>
-            <w:r>
-              <w:rPr>
-                <w:rFonts w:ascii="Times New Roman" w:hAnsi="Times New Roman"/>
-                <w:color w:val="000000" w:themeColor="text1"/>
-                <w:sz w:val="14"/>
-                <w:szCs w:val="14"/>
-              </w:rPr>
-              <w:t xml:space="preserve"> }}</w:t>
+              <w:t w:space="preserve" xml:space="preserve">{{ pro_etx_pers_dur_pro }}</w:t>
+            </w:r>
+            <w:r>
+              <w:rPr>
+                <w:rFonts w:ascii="Times New Roman" w:hAnsi="Times New Roman"/>
+                <w:color w:val="000000" w:themeColor="text1"/>
+                <w:sz w:val="14"/>
+                <w:szCs w:val="14"/>
+              </w:rPr>
+              <w:t/>
+            </w:r>
+            <w:r>
+              <w:rPr>
+                <w:rFonts w:ascii="Times New Roman" w:hAnsi="Times New Roman"/>
+                <w:color w:val="000000" w:themeColor="text1"/>
+                <w:sz w:val="14"/>
+                <w:szCs w:val="14"/>
+              </w:rPr>
+              <w:t xml:space="preserve"/>
             </w:r>
           </w:p>
         </w:tc>
@@ -1654,25 +1654,25 @@
                 <w:sz w:val="14"/>
                 <w:szCs w:val="14"/>
               </w:rPr>
-              <w:t>{{ id_pers_dur</w:t>
-            </w:r>
-            <w:r>
-              <w:rPr>
-                <w:rFonts w:ascii="Times New Roman" w:hAnsi="Times New Roman"/>
-                <w:color w:val="000000" w:themeColor="text1"/>
-                <w:sz w:val="14"/>
-                <w:szCs w:val="14"/>
-              </w:rPr>
-              <w:t>_pro</w:t>
-            </w:r>
-            <w:r>
-              <w:rPr>
-                <w:rFonts w:ascii="Times New Roman" w:hAnsi="Times New Roman"/>
-                <w:color w:val="000000" w:themeColor="text1"/>
-                <w:sz w:val="14"/>
-                <w:szCs w:val="14"/>
-              </w:rPr>
-              <w:t xml:space="preserve"> }}</w:t>
+              <w:t w:space="preserve" xml:space="preserve">{{ pro_id_pers_dur_pro }}</w:t>
+            </w:r>
+            <w:r>
+              <w:rPr>
+                <w:rFonts w:ascii="Times New Roman" w:hAnsi="Times New Roman"/>
+                <w:color w:val="000000" w:themeColor="text1"/>
+                <w:sz w:val="14"/>
+                <w:szCs w:val="14"/>
+              </w:rPr>
+              <w:t/>
+            </w:r>
+            <w:r>
+              <w:rPr>
+                <w:rFonts w:ascii="Times New Roman" w:hAnsi="Times New Roman"/>
+                <w:color w:val="000000" w:themeColor="text1"/>
+                <w:sz w:val="14"/>
+                <w:szCs w:val="14"/>
+              </w:rPr>
+              <w:t xml:space="preserve"/>
             </w:r>
           </w:p>
         </w:tc>
@@ -1815,16 +1815,16 @@
                 <w:sz w:val="14"/>
                 <w:szCs w:val="14"/>
               </w:rPr>
-              <w:t xml:space="preserve"> </w:t>
-            </w:r>
-            <w:r>
-              <w:rPr>
-                <w:rFonts w:ascii="Times New Roman" w:hAnsi="Times New Roman"/>
-                <w:color w:val="000000" w:themeColor="text1"/>
-                <w:sz w:val="14"/>
-                <w:szCs w:val="14"/>
-              </w:rPr>
-              <w:t>{{ after_test }}</w:t>
+              <w:t xml:space="preserve" w:space="preserve"> {{ pro_after_test }}</w:t>
+            </w:r>
+            <w:r>
+              <w:rPr>
+                <w:rFonts w:ascii="Times New Roman" w:hAnsi="Times New Roman"/>
+                <w:color w:val="000000" w:themeColor="text1"/>
+                <w:sz w:val="14"/>
+                <w:szCs w:val="14"/>
+              </w:rPr>
+              <w:t/>
             </w:r>
           </w:p>
         </w:tc>
@@ -1862,16 +1862,16 @@
                 <w:sz w:val="14"/>
                 <w:szCs w:val="14"/>
               </w:rPr>
-              <w:t>{{ analyst_initial }}</w:t>
-            </w:r>
-            <w:r>
-              <w:rPr>
-                <w:rFonts w:ascii="Times New Roman" w:hAnsi="Times New Roman"/>
-                <w:color w:val="000000" w:themeColor="text1"/>
-                <w:sz w:val="14"/>
-                <w:szCs w:val="14"/>
-              </w:rPr>
-              <w:t xml:space="preserve"> </w:t>
+              <w:t w:space="preserve" xml:space="preserve">{{ pro_analyst_initial }} </w:t>
+            </w:r>
+            <w:r>
+              <w:rPr>
+                <w:rFonts w:ascii="Times New Roman" w:hAnsi="Times New Roman"/>
+                <w:color w:val="000000" w:themeColor="text1"/>
+                <w:sz w:val="14"/>
+                <w:szCs w:val="14"/>
+              </w:rPr>
+              <w:t xml:space="preserve"/>
             </w:r>
           </w:p>
         </w:tc>
@@ -1940,7 +1940,7 @@
                 <w:sz w:val="14"/>
                 <w:szCs w:val="14"/>
               </w:rPr>
-              <w:t>{{ af_obs_pers_dur_pro }}</w:t>
+              <w:t w:space="preserve" xml:space="preserve">{{ pro_af_obs_pers_dur_pro }}</w:t>
             </w:r>
           </w:p>
         </w:tc>
@@ -1968,43 +1968,43 @@
                 <w:sz w:val="14"/>
                 <w:szCs w:val="14"/>
               </w:rPr>
-              <w:t xml:space="preserve">{{ </w:t>
-            </w:r>
-            <w:r>
-              <w:rPr>
-                <w:rFonts w:ascii="Times New Roman" w:hAnsi="Times New Roman"/>
-                <w:color w:val="000000" w:themeColor="text1"/>
-                <w:sz w:val="14"/>
-                <w:szCs w:val="14"/>
-              </w:rPr>
-              <w:t>af_</w:t>
-            </w:r>
-            <w:r>
-              <w:rPr>
-                <w:rFonts w:ascii="Times New Roman" w:hAnsi="Times New Roman"/>
-                <w:color w:val="000000" w:themeColor="text1"/>
-                <w:sz w:val="14"/>
-                <w:szCs w:val="14"/>
-              </w:rPr>
-              <w:t>etx_pers_dur</w:t>
-            </w:r>
-            <w:r>
-              <w:rPr>
-                <w:rFonts w:ascii="Times New Roman" w:hAnsi="Times New Roman"/>
-                <w:color w:val="000000" w:themeColor="text1"/>
-                <w:sz w:val="14"/>
-                <w:szCs w:val="14"/>
-              </w:rPr>
-              <w:t>_pro</w:t>
-            </w:r>
-            <w:r>
-              <w:rPr>
-                <w:rFonts w:ascii="Times New Roman" w:hAnsi="Times New Roman"/>
-                <w:color w:val="000000" w:themeColor="text1"/>
-                <w:sz w:val="14"/>
-                <w:szCs w:val="14"/>
-              </w:rPr>
-              <w:t xml:space="preserve"> }}</w:t>
+              <w:t xml:space="preserve" w:space="preserve">{{ pro_af_etx_pers_dur_pro }}</w:t>
+            </w:r>
+            <w:r>
+              <w:rPr>
+                <w:rFonts w:ascii="Times New Roman" w:hAnsi="Times New Roman"/>
+                <w:color w:val="000000" w:themeColor="text1"/>
+                <w:sz w:val="14"/>
+                <w:szCs w:val="14"/>
+              </w:rPr>
+              <w:t/>
+            </w:r>
+            <w:r>
+              <w:rPr>
+                <w:rFonts w:ascii="Times New Roman" w:hAnsi="Times New Roman"/>
+                <w:color w:val="000000" w:themeColor="text1"/>
+                <w:sz w:val="14"/>
+                <w:szCs w:val="14"/>
+              </w:rPr>
+              <w:t/>
+            </w:r>
+            <w:r>
+              <w:rPr>
+                <w:rFonts w:ascii="Times New Roman" w:hAnsi="Times New Roman"/>
+                <w:color w:val="000000" w:themeColor="text1"/>
+                <w:sz w:val="14"/>
+                <w:szCs w:val="14"/>
+              </w:rPr>
+              <w:t/>
+            </w:r>
+            <w:r>
+              <w:rPr>
+                <w:rFonts w:ascii="Times New Roman" w:hAnsi="Times New Roman"/>
+                <w:color w:val="000000" w:themeColor="text1"/>
+                <w:sz w:val="14"/>
+                <w:szCs w:val="14"/>
+              </w:rPr>
+              <w:t xml:space="preserve"/>
             </w:r>
           </w:p>
         </w:tc>
@@ -2032,43 +2032,43 @@
                 <w:sz w:val="14"/>
                 <w:szCs w:val="14"/>
               </w:rPr>
-              <w:t xml:space="preserve">{{ </w:t>
-            </w:r>
-            <w:r>
-              <w:rPr>
-                <w:rFonts w:ascii="Times New Roman" w:hAnsi="Times New Roman"/>
-                <w:color w:val="000000" w:themeColor="text1"/>
-                <w:sz w:val="14"/>
-                <w:szCs w:val="14"/>
-              </w:rPr>
-              <w:t>af_</w:t>
-            </w:r>
-            <w:r>
-              <w:rPr>
-                <w:rFonts w:ascii="Times New Roman" w:hAnsi="Times New Roman"/>
-                <w:color w:val="000000" w:themeColor="text1"/>
-                <w:sz w:val="14"/>
-                <w:szCs w:val="14"/>
-              </w:rPr>
-              <w:t>id_pers_dur</w:t>
-            </w:r>
-            <w:r>
-              <w:rPr>
-                <w:rFonts w:ascii="Times New Roman" w:hAnsi="Times New Roman"/>
-                <w:color w:val="000000" w:themeColor="text1"/>
-                <w:sz w:val="14"/>
-                <w:szCs w:val="14"/>
-              </w:rPr>
-              <w:t>_pro</w:t>
-            </w:r>
-            <w:r>
-              <w:rPr>
-                <w:rFonts w:ascii="Times New Roman" w:hAnsi="Times New Roman"/>
-                <w:color w:val="000000" w:themeColor="text1"/>
-                <w:sz w:val="14"/>
-                <w:szCs w:val="14"/>
-              </w:rPr>
-              <w:t xml:space="preserve"> }}</w:t>
+              <w:t xml:space="preserve" w:space="preserve">{{ pro_af_id_pers_dur_pro }}</w:t>
+            </w:r>
+            <w:r>
+              <w:rPr>
+                <w:rFonts w:ascii="Times New Roman" w:hAnsi="Times New Roman"/>
+                <w:color w:val="000000" w:themeColor="text1"/>
+                <w:sz w:val="14"/>
+                <w:szCs w:val="14"/>
+              </w:rPr>
+              <w:t/>
+            </w:r>
+            <w:r>
+              <w:rPr>
+                <w:rFonts w:ascii="Times New Roman" w:hAnsi="Times New Roman"/>
+                <w:color w:val="000000" w:themeColor="text1"/>
+                <w:sz w:val="14"/>
+                <w:szCs w:val="14"/>
+              </w:rPr>
+              <w:t/>
+            </w:r>
+            <w:r>
+              <w:rPr>
+                <w:rFonts w:ascii="Times New Roman" w:hAnsi="Times New Roman"/>
+                <w:color w:val="000000" w:themeColor="text1"/>
+                <w:sz w:val="14"/>
+                <w:szCs w:val="14"/>
+              </w:rPr>
+              <w:t/>
+            </w:r>
+            <w:r>
+              <w:rPr>
+                <w:rFonts w:ascii="Times New Roman" w:hAnsi="Times New Roman"/>
+                <w:color w:val="000000" w:themeColor="text1"/>
+                <w:sz w:val="14"/>
+                <w:szCs w:val="14"/>
+              </w:rPr>
+              <w:t xml:space="preserve"/>
             </w:r>
           </w:p>
         </w:tc>
@@ -2247,16 +2247,16 @@
                 <w:sz w:val="14"/>
                 <w:szCs w:val="14"/>
               </w:rPr>
-              <w:t xml:space="preserve"> </w:t>
-            </w:r>
-            <w:r>
-              <w:rPr>
-                <w:rFonts w:ascii="Times New Roman" w:hAnsi="Times New Roman"/>
-                <w:color w:val="000000" w:themeColor="text1"/>
-                <w:sz w:val="14"/>
-                <w:szCs w:val="14"/>
-              </w:rPr>
-              <w:t>{{ before_test }}</w:t>
+              <w:t xml:space="preserve" w:space="preserve"> {{ pro_before_test }}</w:t>
+            </w:r>
+            <w:r>
+              <w:rPr>
+                <w:rFonts w:ascii="Times New Roman" w:hAnsi="Times New Roman"/>
+                <w:color w:val="000000" w:themeColor="text1"/>
+                <w:sz w:val="14"/>
+                <w:szCs w:val="14"/>
+              </w:rPr>
+              <w:t/>
             </w:r>
           </w:p>
         </w:tc>
@@ -2294,7 +2294,7 @@
                 <w:sz w:val="14"/>
                 <w:szCs w:val="14"/>
               </w:rPr>
-              <w:t>{{ analyst_initial }}</w:t>
+              <w:t w:space="preserve" xml:space="preserve">{{ pro_analyst_initial }}</w:t>
             </w:r>
           </w:p>
         </w:tc>
@@ -2363,43 +2363,43 @@
                 <w:sz w:val="14"/>
                 <w:szCs w:val="14"/>
               </w:rPr>
-              <w:t xml:space="preserve">{{ </w:t>
-            </w:r>
-            <w:r>
-              <w:rPr>
-                <w:rFonts w:ascii="Times New Roman" w:hAnsi="Times New Roman"/>
-                <w:color w:val="000000" w:themeColor="text1"/>
-                <w:sz w:val="14"/>
-                <w:szCs w:val="14"/>
-              </w:rPr>
-              <w:t>be_</w:t>
-            </w:r>
-            <w:r>
-              <w:rPr>
-                <w:rFonts w:ascii="Times New Roman" w:hAnsi="Times New Roman"/>
-                <w:color w:val="000000" w:themeColor="text1"/>
-                <w:sz w:val="14"/>
-                <w:szCs w:val="14"/>
-              </w:rPr>
-              <w:t>obs_surf_dur</w:t>
-            </w:r>
-            <w:r>
-              <w:rPr>
-                <w:rFonts w:ascii="Times New Roman" w:hAnsi="Times New Roman"/>
-                <w:color w:val="000000" w:themeColor="text1"/>
-                <w:sz w:val="14"/>
-                <w:szCs w:val="14"/>
-              </w:rPr>
-              <w:t>_pro</w:t>
-            </w:r>
-            <w:r>
-              <w:rPr>
-                <w:rFonts w:ascii="Times New Roman" w:hAnsi="Times New Roman"/>
-                <w:color w:val="000000" w:themeColor="text1"/>
-                <w:sz w:val="14"/>
-                <w:szCs w:val="14"/>
-              </w:rPr>
-              <w:t xml:space="preserve"> }}</w:t>
+              <w:t xml:space="preserve" w:space="preserve">{{ pro_be_obs_surf_dur_pro }}</w:t>
+            </w:r>
+            <w:r>
+              <w:rPr>
+                <w:rFonts w:ascii="Times New Roman" w:hAnsi="Times New Roman"/>
+                <w:color w:val="000000" w:themeColor="text1"/>
+                <w:sz w:val="14"/>
+                <w:szCs w:val="14"/>
+              </w:rPr>
+              <w:t/>
+            </w:r>
+            <w:r>
+              <w:rPr>
+                <w:rFonts w:ascii="Times New Roman" w:hAnsi="Times New Roman"/>
+                <w:color w:val="000000" w:themeColor="text1"/>
+                <w:sz w:val="14"/>
+                <w:szCs w:val="14"/>
+              </w:rPr>
+              <w:t/>
+            </w:r>
+            <w:r>
+              <w:rPr>
+                <w:rFonts w:ascii="Times New Roman" w:hAnsi="Times New Roman"/>
+                <w:color w:val="000000" w:themeColor="text1"/>
+                <w:sz w:val="14"/>
+                <w:szCs w:val="14"/>
+              </w:rPr>
+              <w:t/>
+            </w:r>
+            <w:r>
+              <w:rPr>
+                <w:rFonts w:ascii="Times New Roman" w:hAnsi="Times New Roman"/>
+                <w:color w:val="000000" w:themeColor="text1"/>
+                <w:sz w:val="14"/>
+                <w:szCs w:val="14"/>
+              </w:rPr>
+              <w:t xml:space="preserve"/>
             </w:r>
           </w:p>
         </w:tc>
@@ -2427,43 +2427,43 @@
                 <w:sz w:val="14"/>
                 <w:szCs w:val="14"/>
               </w:rPr>
-              <w:t xml:space="preserve">{{ </w:t>
-            </w:r>
-            <w:r>
-              <w:rPr>
-                <w:rFonts w:ascii="Times New Roman" w:hAnsi="Times New Roman"/>
-                <w:color w:val="000000" w:themeColor="text1"/>
-                <w:sz w:val="14"/>
-                <w:szCs w:val="14"/>
-              </w:rPr>
-              <w:t>be_</w:t>
-            </w:r>
-            <w:r>
-              <w:rPr>
-                <w:rFonts w:ascii="Times New Roman" w:hAnsi="Times New Roman"/>
-                <w:color w:val="000000" w:themeColor="text1"/>
-                <w:sz w:val="14"/>
-                <w:szCs w:val="14"/>
-              </w:rPr>
-              <w:t>etx_surf_dur</w:t>
-            </w:r>
-            <w:r>
-              <w:rPr>
-                <w:rFonts w:ascii="Times New Roman" w:hAnsi="Times New Roman"/>
-                <w:color w:val="000000" w:themeColor="text1"/>
-                <w:sz w:val="14"/>
-                <w:szCs w:val="14"/>
-              </w:rPr>
-              <w:t>_pro</w:t>
-            </w:r>
-            <w:r>
-              <w:rPr>
-                <w:rFonts w:ascii="Times New Roman" w:hAnsi="Times New Roman"/>
-                <w:color w:val="000000" w:themeColor="text1"/>
-                <w:sz w:val="14"/>
-                <w:szCs w:val="14"/>
-              </w:rPr>
-              <w:t xml:space="preserve"> }}</w:t>
+              <w:t xml:space="preserve" w:space="preserve">{{ pro_be_etx_surf_dur_pro }}</w:t>
+            </w:r>
+            <w:r>
+              <w:rPr>
+                <w:rFonts w:ascii="Times New Roman" w:hAnsi="Times New Roman"/>
+                <w:color w:val="000000" w:themeColor="text1"/>
+                <w:sz w:val="14"/>
+                <w:szCs w:val="14"/>
+              </w:rPr>
+              <w:t/>
+            </w:r>
+            <w:r>
+              <w:rPr>
+                <w:rFonts w:ascii="Times New Roman" w:hAnsi="Times New Roman"/>
+                <w:color w:val="000000" w:themeColor="text1"/>
+                <w:sz w:val="14"/>
+                <w:szCs w:val="14"/>
+              </w:rPr>
+              <w:t/>
+            </w:r>
+            <w:r>
+              <w:rPr>
+                <w:rFonts w:ascii="Times New Roman" w:hAnsi="Times New Roman"/>
+                <w:color w:val="000000" w:themeColor="text1"/>
+                <w:sz w:val="14"/>
+                <w:szCs w:val="14"/>
+              </w:rPr>
+              <w:t/>
+            </w:r>
+            <w:r>
+              <w:rPr>
+                <w:rFonts w:ascii="Times New Roman" w:hAnsi="Times New Roman"/>
+                <w:color w:val="000000" w:themeColor="text1"/>
+                <w:sz w:val="14"/>
+                <w:szCs w:val="14"/>
+              </w:rPr>
+              <w:t xml:space="preserve"/>
             </w:r>
           </w:p>
         </w:tc>
@@ -2491,43 +2491,43 @@
                 <w:sz w:val="14"/>
                 <w:szCs w:val="14"/>
               </w:rPr>
-              <w:t xml:space="preserve">{{ </w:t>
-            </w:r>
-            <w:r>
-              <w:rPr>
-                <w:rFonts w:ascii="Times New Roman" w:hAnsi="Times New Roman"/>
-                <w:color w:val="000000" w:themeColor="text1"/>
-                <w:sz w:val="14"/>
-                <w:szCs w:val="14"/>
-              </w:rPr>
-              <w:t>be_</w:t>
-            </w:r>
-            <w:r>
-              <w:rPr>
-                <w:rFonts w:ascii="Times New Roman" w:hAnsi="Times New Roman"/>
-                <w:color w:val="000000" w:themeColor="text1"/>
-                <w:sz w:val="14"/>
-                <w:szCs w:val="14"/>
-              </w:rPr>
-              <w:t>id_surf_dur</w:t>
-            </w:r>
-            <w:r>
-              <w:rPr>
-                <w:rFonts w:ascii="Times New Roman" w:hAnsi="Times New Roman"/>
-                <w:color w:val="000000" w:themeColor="text1"/>
-                <w:sz w:val="14"/>
-                <w:szCs w:val="14"/>
-              </w:rPr>
-              <w:t>_pro</w:t>
-            </w:r>
-            <w:r>
-              <w:rPr>
-                <w:rFonts w:ascii="Times New Roman" w:hAnsi="Times New Roman"/>
-                <w:color w:val="000000" w:themeColor="text1"/>
-                <w:sz w:val="14"/>
-                <w:szCs w:val="14"/>
-              </w:rPr>
-              <w:t xml:space="preserve"> }}</w:t>
+              <w:t xml:space="preserve" w:space="preserve">{{ pro_be_id_surf_dur_pro }}</w:t>
+            </w:r>
+            <w:r>
+              <w:rPr>
+                <w:rFonts w:ascii="Times New Roman" w:hAnsi="Times New Roman"/>
+                <w:color w:val="000000" w:themeColor="text1"/>
+                <w:sz w:val="14"/>
+                <w:szCs w:val="14"/>
+              </w:rPr>
+              <w:t/>
+            </w:r>
+            <w:r>
+              <w:rPr>
+                <w:rFonts w:ascii="Times New Roman" w:hAnsi="Times New Roman"/>
+                <w:color w:val="000000" w:themeColor="text1"/>
+                <w:sz w:val="14"/>
+                <w:szCs w:val="14"/>
+              </w:rPr>
+              <w:t/>
+            </w:r>
+            <w:r>
+              <w:rPr>
+                <w:rFonts w:ascii="Times New Roman" w:hAnsi="Times New Roman"/>
+                <w:color w:val="000000" w:themeColor="text1"/>
+                <w:sz w:val="14"/>
+                <w:szCs w:val="14"/>
+              </w:rPr>
+              <w:t/>
+            </w:r>
+            <w:r>
+              <w:rPr>
+                <w:rFonts w:ascii="Times New Roman" w:hAnsi="Times New Roman"/>
+                <w:color w:val="000000" w:themeColor="text1"/>
+                <w:sz w:val="14"/>
+                <w:szCs w:val="14"/>
+              </w:rPr>
+              <w:t xml:space="preserve"/>
             </w:r>
           </w:p>
         </w:tc>
@@ -2684,16 +2684,16 @@
                 <w:sz w:val="14"/>
                 <w:szCs w:val="14"/>
               </w:rPr>
-              <w:t xml:space="preserve"> </w:t>
-            </w:r>
-            <w:r>
-              <w:rPr>
-                <w:rFonts w:ascii="Times New Roman" w:hAnsi="Times New Roman"/>
-                <w:color w:val="000000" w:themeColor="text1"/>
-                <w:sz w:val="14"/>
-                <w:szCs w:val="14"/>
-              </w:rPr>
-              <w:t>{{ test_date }}</w:t>
+              <w:t xml:space="preserve" w:space="preserve"> {{ pro_test_date }}</w:t>
+            </w:r>
+            <w:r>
+              <w:rPr>
+                <w:rFonts w:ascii="Times New Roman" w:hAnsi="Times New Roman"/>
+                <w:color w:val="000000" w:themeColor="text1"/>
+                <w:sz w:val="14"/>
+                <w:szCs w:val="14"/>
+              </w:rPr>
+              <w:t/>
             </w:r>
           </w:p>
         </w:tc>
@@ -2731,16 +2731,16 @@
                 <w:sz w:val="14"/>
                 <w:szCs w:val="14"/>
               </w:rPr>
-              <w:t>{{ analyst_initial }}</w:t>
-            </w:r>
-            <w:r>
-              <w:rPr>
-                <w:rFonts w:ascii="Times New Roman" w:hAnsi="Times New Roman"/>
-                <w:color w:val="000000" w:themeColor="text1"/>
-                <w:sz w:val="14"/>
-                <w:szCs w:val="14"/>
-              </w:rPr>
-              <w:t xml:space="preserve"> </w:t>
+              <w:t w:space="preserve" xml:space="preserve">{{ pro_analyst_initial }} </w:t>
+            </w:r>
+            <w:r>
+              <w:rPr>
+                <w:rFonts w:ascii="Times New Roman" w:hAnsi="Times New Roman"/>
+                <w:color w:val="000000" w:themeColor="text1"/>
+                <w:sz w:val="14"/>
+                <w:szCs w:val="14"/>
+              </w:rPr>
+              <w:t xml:space="preserve"/>
             </w:r>
           </w:p>
         </w:tc>
@@ -2809,25 +2809,25 @@
                 <w:sz w:val="14"/>
                 <w:szCs w:val="14"/>
               </w:rPr>
-              <w:t>{{ obs_surf_dur</w:t>
-            </w:r>
-            <w:r>
-              <w:rPr>
-                <w:rFonts w:ascii="Times New Roman" w:hAnsi="Times New Roman"/>
-                <w:color w:val="000000" w:themeColor="text1"/>
-                <w:sz w:val="14"/>
-                <w:szCs w:val="14"/>
-              </w:rPr>
-              <w:t>_pro</w:t>
-            </w:r>
-            <w:r>
-              <w:rPr>
-                <w:rFonts w:ascii="Times New Roman" w:hAnsi="Times New Roman"/>
-                <w:color w:val="000000" w:themeColor="text1"/>
-                <w:sz w:val="14"/>
-                <w:szCs w:val="14"/>
-              </w:rPr>
-              <w:t xml:space="preserve"> }}</w:t>
+              <w:t w:space="preserve" xml:space="preserve">{{ pro_obs_surf_dur_pro }}</w:t>
+            </w:r>
+            <w:r>
+              <w:rPr>
+                <w:rFonts w:ascii="Times New Roman" w:hAnsi="Times New Roman"/>
+                <w:color w:val="000000" w:themeColor="text1"/>
+                <w:sz w:val="14"/>
+                <w:szCs w:val="14"/>
+              </w:rPr>
+              <w:t/>
+            </w:r>
+            <w:r>
+              <w:rPr>
+                <w:rFonts w:ascii="Times New Roman" w:hAnsi="Times New Roman"/>
+                <w:color w:val="000000" w:themeColor="text1"/>
+                <w:sz w:val="14"/>
+                <w:szCs w:val="14"/>
+              </w:rPr>
+              <w:t xml:space="preserve"/>
             </w:r>
           </w:p>
         </w:tc>
@@ -2863,25 +2863,25 @@
                 <w:sz w:val="14"/>
                 <w:szCs w:val="14"/>
               </w:rPr>
-              <w:t>{{ etx_surf_dur</w:t>
-            </w:r>
-            <w:r>
-              <w:rPr>
-                <w:rFonts w:ascii="Times New Roman" w:hAnsi="Times New Roman"/>
-                <w:color w:val="000000" w:themeColor="text1"/>
-                <w:sz w:val="14"/>
-                <w:szCs w:val="14"/>
-              </w:rPr>
-              <w:t>_pro</w:t>
-            </w:r>
-            <w:r>
-              <w:rPr>
-                <w:rFonts w:ascii="Times New Roman" w:hAnsi="Times New Roman"/>
-                <w:color w:val="000000" w:themeColor="text1"/>
-                <w:sz w:val="14"/>
-                <w:szCs w:val="14"/>
-              </w:rPr>
-              <w:t xml:space="preserve"> }}</w:t>
+              <w:t w:space="preserve" xml:space="preserve">{{ pro_etx_surf_dur_pro }}</w:t>
+            </w:r>
+            <w:r>
+              <w:rPr>
+                <w:rFonts w:ascii="Times New Roman" w:hAnsi="Times New Roman"/>
+                <w:color w:val="000000" w:themeColor="text1"/>
+                <w:sz w:val="14"/>
+                <w:szCs w:val="14"/>
+              </w:rPr>
+              <w:t/>
+            </w:r>
+            <w:r>
+              <w:rPr>
+                <w:rFonts w:ascii="Times New Roman" w:hAnsi="Times New Roman"/>
+                <w:color w:val="000000" w:themeColor="text1"/>
+                <w:sz w:val="14"/>
+                <w:szCs w:val="14"/>
+              </w:rPr>
+              <w:t xml:space="preserve"/>
             </w:r>
           </w:p>
         </w:tc>
@@ -2917,25 +2917,25 @@
                 <w:sz w:val="14"/>
                 <w:szCs w:val="14"/>
               </w:rPr>
-              <w:t>{{ id_surf_dur</w:t>
-            </w:r>
-            <w:r>
-              <w:rPr>
-                <w:rFonts w:ascii="Times New Roman" w:hAnsi="Times New Roman"/>
-                <w:color w:val="000000" w:themeColor="text1"/>
-                <w:sz w:val="14"/>
-                <w:szCs w:val="14"/>
-              </w:rPr>
-              <w:t>_pro</w:t>
-            </w:r>
-            <w:r>
-              <w:rPr>
-                <w:rFonts w:ascii="Times New Roman" w:hAnsi="Times New Roman"/>
-                <w:color w:val="000000" w:themeColor="text1"/>
-                <w:sz w:val="14"/>
-                <w:szCs w:val="14"/>
-              </w:rPr>
-              <w:t xml:space="preserve"> }}</w:t>
+              <w:t w:space="preserve" xml:space="preserve">{{ pro_id_surf_dur_pro }}</w:t>
+            </w:r>
+            <w:r>
+              <w:rPr>
+                <w:rFonts w:ascii="Times New Roman" w:hAnsi="Times New Roman"/>
+                <w:color w:val="000000" w:themeColor="text1"/>
+                <w:sz w:val="14"/>
+                <w:szCs w:val="14"/>
+              </w:rPr>
+              <w:t/>
+            </w:r>
+            <w:r>
+              <w:rPr>
+                <w:rFonts w:ascii="Times New Roman" w:hAnsi="Times New Roman"/>
+                <w:color w:val="000000" w:themeColor="text1"/>
+                <w:sz w:val="14"/>
+                <w:szCs w:val="14"/>
+              </w:rPr>
+              <w:t xml:space="preserve"/>
             </w:r>
           </w:p>
         </w:tc>
@@ -3078,16 +3078,16 @@
                 <w:sz w:val="14"/>
                 <w:szCs w:val="14"/>
               </w:rPr>
-              <w:t xml:space="preserve"> </w:t>
-            </w:r>
-            <w:r>
-              <w:rPr>
-                <w:rFonts w:ascii="Times New Roman" w:hAnsi="Times New Roman"/>
-                <w:color w:val="000000" w:themeColor="text1"/>
-                <w:sz w:val="14"/>
-                <w:szCs w:val="14"/>
-              </w:rPr>
-              <w:t>{{ after_test }}</w:t>
+              <w:t xml:space="preserve" w:space="preserve"> {{ pro_after_test }}</w:t>
+            </w:r>
+            <w:r>
+              <w:rPr>
+                <w:rFonts w:ascii="Times New Roman" w:hAnsi="Times New Roman"/>
+                <w:color w:val="000000" w:themeColor="text1"/>
+                <w:sz w:val="14"/>
+                <w:szCs w:val="14"/>
+              </w:rPr>
+              <w:t/>
             </w:r>
           </w:p>
         </w:tc>
@@ -3125,16 +3125,16 @@
                 <w:sz w:val="14"/>
                 <w:szCs w:val="14"/>
               </w:rPr>
-              <w:t>{{ analyst_initial }}</w:t>
-            </w:r>
-            <w:r>
-              <w:rPr>
-                <w:rFonts w:ascii="Times New Roman" w:hAnsi="Times New Roman"/>
-                <w:color w:val="000000" w:themeColor="text1"/>
-                <w:sz w:val="14"/>
-                <w:szCs w:val="14"/>
-              </w:rPr>
-              <w:t xml:space="preserve"> </w:t>
+              <w:t w:space="preserve" xml:space="preserve">{{ pro_analyst_initial }} </w:t>
+            </w:r>
+            <w:r>
+              <w:rPr>
+                <w:rFonts w:ascii="Times New Roman" w:hAnsi="Times New Roman"/>
+                <w:color w:val="000000" w:themeColor="text1"/>
+                <w:sz w:val="14"/>
+                <w:szCs w:val="14"/>
+              </w:rPr>
+              <w:t xml:space="preserve"/>
             </w:r>
           </w:p>
         </w:tc>
@@ -3203,43 +3203,43 @@
                 <w:sz w:val="14"/>
                 <w:szCs w:val="14"/>
               </w:rPr>
-              <w:t xml:space="preserve">{{ </w:t>
-            </w:r>
-            <w:r>
-              <w:rPr>
-                <w:rFonts w:ascii="Times New Roman" w:hAnsi="Times New Roman"/>
-                <w:color w:val="000000" w:themeColor="text1"/>
-                <w:sz w:val="14"/>
-                <w:szCs w:val="14"/>
-              </w:rPr>
-              <w:t>af_</w:t>
-            </w:r>
-            <w:r>
-              <w:rPr>
-                <w:rFonts w:ascii="Times New Roman" w:hAnsi="Times New Roman"/>
-                <w:color w:val="000000" w:themeColor="text1"/>
-                <w:sz w:val="14"/>
-                <w:szCs w:val="14"/>
-              </w:rPr>
-              <w:t>obs_surf_dur</w:t>
-            </w:r>
-            <w:r>
-              <w:rPr>
-                <w:rFonts w:ascii="Times New Roman" w:hAnsi="Times New Roman"/>
-                <w:color w:val="000000" w:themeColor="text1"/>
-                <w:sz w:val="14"/>
-                <w:szCs w:val="14"/>
-              </w:rPr>
-              <w:t>_pro</w:t>
-            </w:r>
-            <w:r>
-              <w:rPr>
-                <w:rFonts w:ascii="Times New Roman" w:hAnsi="Times New Roman"/>
-                <w:color w:val="000000" w:themeColor="text1"/>
-                <w:sz w:val="14"/>
-                <w:szCs w:val="14"/>
-              </w:rPr>
-              <w:t xml:space="preserve"> }}</w:t>
+              <w:t xml:space="preserve" w:space="preserve">{{ pro_af_obs_surf_dur_pro }}</w:t>
+            </w:r>
+            <w:r>
+              <w:rPr>
+                <w:rFonts w:ascii="Times New Roman" w:hAnsi="Times New Roman"/>
+                <w:color w:val="000000" w:themeColor="text1"/>
+                <w:sz w:val="14"/>
+                <w:szCs w:val="14"/>
+              </w:rPr>
+              <w:t/>
+            </w:r>
+            <w:r>
+              <w:rPr>
+                <w:rFonts w:ascii="Times New Roman" w:hAnsi="Times New Roman"/>
+                <w:color w:val="000000" w:themeColor="text1"/>
+                <w:sz w:val="14"/>
+                <w:szCs w:val="14"/>
+              </w:rPr>
+              <w:t/>
+            </w:r>
+            <w:r>
+              <w:rPr>
+                <w:rFonts w:ascii="Times New Roman" w:hAnsi="Times New Roman"/>
+                <w:color w:val="000000" w:themeColor="text1"/>
+                <w:sz w:val="14"/>
+                <w:szCs w:val="14"/>
+              </w:rPr>
+              <w:t/>
+            </w:r>
+            <w:r>
+              <w:rPr>
+                <w:rFonts w:ascii="Times New Roman" w:hAnsi="Times New Roman"/>
+                <w:color w:val="000000" w:themeColor="text1"/>
+                <w:sz w:val="14"/>
+                <w:szCs w:val="14"/>
+              </w:rPr>
+              <w:t xml:space="preserve"/>
             </w:r>
           </w:p>
         </w:tc>
@@ -3267,43 +3267,43 @@
                 <w:sz w:val="14"/>
                 <w:szCs w:val="14"/>
               </w:rPr>
-              <w:t xml:space="preserve">{{ </w:t>
-            </w:r>
-            <w:r>
-              <w:rPr>
-                <w:rFonts w:ascii="Times New Roman" w:hAnsi="Times New Roman"/>
-                <w:color w:val="000000" w:themeColor="text1"/>
-                <w:sz w:val="14"/>
-                <w:szCs w:val="14"/>
-              </w:rPr>
-              <w:t>af_</w:t>
-            </w:r>
-            <w:r>
-              <w:rPr>
-                <w:rFonts w:ascii="Times New Roman" w:hAnsi="Times New Roman"/>
-                <w:color w:val="000000" w:themeColor="text1"/>
-                <w:sz w:val="14"/>
-                <w:szCs w:val="14"/>
-              </w:rPr>
-              <w:t>etx_surf_dur</w:t>
-            </w:r>
-            <w:r>
-              <w:rPr>
-                <w:rFonts w:ascii="Times New Roman" w:hAnsi="Times New Roman"/>
-                <w:color w:val="000000" w:themeColor="text1"/>
-                <w:sz w:val="14"/>
-                <w:szCs w:val="14"/>
-              </w:rPr>
-              <w:t>_pro</w:t>
-            </w:r>
-            <w:r>
-              <w:rPr>
-                <w:rFonts w:ascii="Times New Roman" w:hAnsi="Times New Roman"/>
-                <w:color w:val="000000" w:themeColor="text1"/>
-                <w:sz w:val="14"/>
-                <w:szCs w:val="14"/>
-              </w:rPr>
-              <w:t xml:space="preserve"> }}</w:t>
+              <w:t xml:space="preserve" w:space="preserve">{{ pro_af_etx_surf_dur_pro }}</w:t>
+            </w:r>
+            <w:r>
+              <w:rPr>
+                <w:rFonts w:ascii="Times New Roman" w:hAnsi="Times New Roman"/>
+                <w:color w:val="000000" w:themeColor="text1"/>
+                <w:sz w:val="14"/>
+                <w:szCs w:val="14"/>
+              </w:rPr>
+              <w:t/>
+            </w:r>
+            <w:r>
+              <w:rPr>
+                <w:rFonts w:ascii="Times New Roman" w:hAnsi="Times New Roman"/>
+                <w:color w:val="000000" w:themeColor="text1"/>
+                <w:sz w:val="14"/>
+                <w:szCs w:val="14"/>
+              </w:rPr>
+              <w:t/>
+            </w:r>
+            <w:r>
+              <w:rPr>
+                <w:rFonts w:ascii="Times New Roman" w:hAnsi="Times New Roman"/>
+                <w:color w:val="000000" w:themeColor="text1"/>
+                <w:sz w:val="14"/>
+                <w:szCs w:val="14"/>
+              </w:rPr>
+              <w:t/>
+            </w:r>
+            <w:r>
+              <w:rPr>
+                <w:rFonts w:ascii="Times New Roman" w:hAnsi="Times New Roman"/>
+                <w:color w:val="000000" w:themeColor="text1"/>
+                <w:sz w:val="14"/>
+                <w:szCs w:val="14"/>
+              </w:rPr>
+              <w:t xml:space="preserve"/>
             </w:r>
           </w:p>
         </w:tc>
@@ -3331,43 +3331,43 @@
                 <w:sz w:val="14"/>
                 <w:szCs w:val="14"/>
               </w:rPr>
-              <w:t xml:space="preserve">{{ </w:t>
-            </w:r>
-            <w:r>
-              <w:rPr>
-                <w:rFonts w:ascii="Times New Roman" w:hAnsi="Times New Roman"/>
-                <w:color w:val="000000" w:themeColor="text1"/>
-                <w:sz w:val="14"/>
-                <w:szCs w:val="14"/>
-              </w:rPr>
-              <w:t>af_</w:t>
-            </w:r>
-            <w:r>
-              <w:rPr>
-                <w:rFonts w:ascii="Times New Roman" w:hAnsi="Times New Roman"/>
-                <w:color w:val="000000" w:themeColor="text1"/>
-                <w:sz w:val="14"/>
-                <w:szCs w:val="14"/>
-              </w:rPr>
-              <w:t>id_surf_dur</w:t>
-            </w:r>
-            <w:r>
-              <w:rPr>
-                <w:rFonts w:ascii="Times New Roman" w:hAnsi="Times New Roman"/>
-                <w:color w:val="000000" w:themeColor="text1"/>
-                <w:sz w:val="14"/>
-                <w:szCs w:val="14"/>
-              </w:rPr>
-              <w:t>_pro</w:t>
-            </w:r>
-            <w:r>
-              <w:rPr>
-                <w:rFonts w:ascii="Times New Roman" w:hAnsi="Times New Roman"/>
-                <w:color w:val="000000" w:themeColor="text1"/>
-                <w:sz w:val="14"/>
-                <w:szCs w:val="14"/>
-              </w:rPr>
-              <w:t xml:space="preserve"> }}</w:t>
+              <w:t xml:space="preserve" w:space="preserve">{{ pro_af_id_surf_dur_pro }}</w:t>
+            </w:r>
+            <w:r>
+              <w:rPr>
+                <w:rFonts w:ascii="Times New Roman" w:hAnsi="Times New Roman"/>
+                <w:color w:val="000000" w:themeColor="text1"/>
+                <w:sz w:val="14"/>
+                <w:szCs w:val="14"/>
+              </w:rPr>
+              <w:t/>
+            </w:r>
+            <w:r>
+              <w:rPr>
+                <w:rFonts w:ascii="Times New Roman" w:hAnsi="Times New Roman"/>
+                <w:color w:val="000000" w:themeColor="text1"/>
+                <w:sz w:val="14"/>
+                <w:szCs w:val="14"/>
+              </w:rPr>
+              <w:t/>
+            </w:r>
+            <w:r>
+              <w:rPr>
+                <w:rFonts w:ascii="Times New Roman" w:hAnsi="Times New Roman"/>
+                <w:color w:val="000000" w:themeColor="text1"/>
+                <w:sz w:val="14"/>
+                <w:szCs w:val="14"/>
+              </w:rPr>
+              <w:t/>
+            </w:r>
+            <w:r>
+              <w:rPr>
+                <w:rFonts w:ascii="Times New Roman" w:hAnsi="Times New Roman"/>
+                <w:color w:val="000000" w:themeColor="text1"/>
+                <w:sz w:val="14"/>
+                <w:szCs w:val="14"/>
+              </w:rPr>
+              <w:t xml:space="preserve"/>
             </w:r>
           </w:p>
         </w:tc>
@@ -3510,7 +3510,7 @@
                 <w:sz w:val="14"/>
                 <w:szCs w:val="14"/>
               </w:rPr>
-              <w:t>{{ before_test }}</w:t>
+              <w:t w:space="preserve" xml:space="preserve">{{ pro_before_test }}</w:t>
             </w:r>
           </w:p>
         </w:tc>
@@ -3548,7 +3548,7 @@
                 <w:sz w:val="14"/>
                 <w:szCs w:val="14"/>
               </w:rPr>
-              <w:t>{{ analyst_initial }}</w:t>
+              <w:t w:space="preserve" xml:space="preserve">{{ pro_analyst_initial }}</w:t>
             </w:r>
           </w:p>
         </w:tc>
@@ -3617,7 +3617,7 @@
                 <w:sz w:val="14"/>
                 <w:szCs w:val="14"/>
               </w:rPr>
-              <w:t xml:space="preserve">{{ </w:t>
+              <w:t xml:space="preserve" w:space="preserve">{{ pro_be_obs_sett_dur_pro }}</w:t>
             </w:r>
             <w:r>
               <w:rPr>
@@ -3627,34 +3627,34 @@
                 <w:szCs w:val="14"/>
                 <w:lang w:eastAsia="zh-CN"/>
               </w:rPr>
-              <w:t>be_</w:t>
-            </w:r>
-            <w:r>
-              <w:rPr>
-                <w:rFonts w:ascii="Times New Roman" w:hAnsi="Times New Roman"/>
-                <w:color w:val="000000" w:themeColor="text1"/>
-                <w:sz w:val="14"/>
-                <w:szCs w:val="14"/>
-              </w:rPr>
-              <w:t>obs_sett_dur</w:t>
-            </w:r>
-            <w:r>
-              <w:rPr>
-                <w:rFonts w:ascii="Times New Roman" w:hAnsi="Times New Roman"/>
-                <w:color w:val="000000" w:themeColor="text1"/>
-                <w:sz w:val="14"/>
-                <w:szCs w:val="14"/>
-              </w:rPr>
-              <w:t>_pro</w:t>
-            </w:r>
-            <w:r>
-              <w:rPr>
-                <w:rFonts w:ascii="Times New Roman" w:hAnsi="Times New Roman"/>
-                <w:color w:val="000000" w:themeColor="text1"/>
-                <w:sz w:val="14"/>
-                <w:szCs w:val="14"/>
-              </w:rPr>
-              <w:t xml:space="preserve"> }}</w:t>
+              <w:t/>
+            </w:r>
+            <w:r>
+              <w:rPr>
+                <w:rFonts w:ascii="Times New Roman" w:hAnsi="Times New Roman"/>
+                <w:color w:val="000000" w:themeColor="text1"/>
+                <w:sz w:val="14"/>
+                <w:szCs w:val="14"/>
+              </w:rPr>
+              <w:t/>
+            </w:r>
+            <w:r>
+              <w:rPr>
+                <w:rFonts w:ascii="Times New Roman" w:hAnsi="Times New Roman"/>
+                <w:color w:val="000000" w:themeColor="text1"/>
+                <w:sz w:val="14"/>
+                <w:szCs w:val="14"/>
+              </w:rPr>
+              <w:t/>
+            </w:r>
+            <w:r>
+              <w:rPr>
+                <w:rFonts w:ascii="Times New Roman" w:hAnsi="Times New Roman"/>
+                <w:color w:val="000000" w:themeColor="text1"/>
+                <w:sz w:val="14"/>
+                <w:szCs w:val="14"/>
+              </w:rPr>
+              <w:t xml:space="preserve"/>
             </w:r>
           </w:p>
         </w:tc>
@@ -3682,7 +3682,7 @@
                 <w:sz w:val="14"/>
                 <w:szCs w:val="14"/>
               </w:rPr>
-              <w:t xml:space="preserve">{{ </w:t>
+              <w:t xml:space="preserve" w:space="preserve">{{ pro_be_etx_sett_dur_pro }}</w:t>
             </w:r>
             <w:r>
               <w:rPr>
@@ -3692,34 +3692,34 @@
                 <w:szCs w:val="14"/>
                 <w:lang w:eastAsia="zh-CN"/>
               </w:rPr>
-              <w:t>be_</w:t>
-            </w:r>
-            <w:r>
-              <w:rPr>
-                <w:rFonts w:ascii="Times New Roman" w:hAnsi="Times New Roman"/>
-                <w:color w:val="000000" w:themeColor="text1"/>
-                <w:sz w:val="14"/>
-                <w:szCs w:val="14"/>
-              </w:rPr>
-              <w:t>etx_sett_dur</w:t>
-            </w:r>
-            <w:r>
-              <w:rPr>
-                <w:rFonts w:ascii="Times New Roman" w:hAnsi="Times New Roman"/>
-                <w:color w:val="000000" w:themeColor="text1"/>
-                <w:sz w:val="14"/>
-                <w:szCs w:val="14"/>
-              </w:rPr>
-              <w:t>_pro</w:t>
-            </w:r>
-            <w:r>
-              <w:rPr>
-                <w:rFonts w:ascii="Times New Roman" w:hAnsi="Times New Roman"/>
-                <w:color w:val="000000" w:themeColor="text1"/>
-                <w:sz w:val="14"/>
-                <w:szCs w:val="14"/>
-              </w:rPr>
-              <w:t xml:space="preserve"> }}</w:t>
+              <w:t/>
+            </w:r>
+            <w:r>
+              <w:rPr>
+                <w:rFonts w:ascii="Times New Roman" w:hAnsi="Times New Roman"/>
+                <w:color w:val="000000" w:themeColor="text1"/>
+                <w:sz w:val="14"/>
+                <w:szCs w:val="14"/>
+              </w:rPr>
+              <w:t/>
+            </w:r>
+            <w:r>
+              <w:rPr>
+                <w:rFonts w:ascii="Times New Roman" w:hAnsi="Times New Roman"/>
+                <w:color w:val="000000" w:themeColor="text1"/>
+                <w:sz w:val="14"/>
+                <w:szCs w:val="14"/>
+              </w:rPr>
+              <w:t/>
+            </w:r>
+            <w:r>
+              <w:rPr>
+                <w:rFonts w:ascii="Times New Roman" w:hAnsi="Times New Roman"/>
+                <w:color w:val="000000" w:themeColor="text1"/>
+                <w:sz w:val="14"/>
+                <w:szCs w:val="14"/>
+              </w:rPr>
+              <w:t xml:space="preserve"/>
             </w:r>
           </w:p>
         </w:tc>
@@ -3747,7 +3747,7 @@
                 <w:sz w:val="14"/>
                 <w:szCs w:val="14"/>
               </w:rPr>
-              <w:t xml:space="preserve">{{ </w:t>
+              <w:t xml:space="preserve" w:space="preserve">{{ pro_be_id_sett_dur_pro }}</w:t>
             </w:r>
             <w:r>
               <w:rPr>
@@ -3757,34 +3757,34 @@
                 <w:szCs w:val="14"/>
                 <w:lang w:eastAsia="zh-CN"/>
               </w:rPr>
-              <w:t>be_</w:t>
-            </w:r>
-            <w:r>
-              <w:rPr>
-                <w:rFonts w:ascii="Times New Roman" w:hAnsi="Times New Roman"/>
-                <w:color w:val="000000" w:themeColor="text1"/>
-                <w:sz w:val="14"/>
-                <w:szCs w:val="14"/>
-              </w:rPr>
-              <w:t>id_sett_dur</w:t>
-            </w:r>
-            <w:r>
-              <w:rPr>
-                <w:rFonts w:ascii="Times New Roman" w:hAnsi="Times New Roman"/>
-                <w:color w:val="000000" w:themeColor="text1"/>
-                <w:sz w:val="14"/>
-                <w:szCs w:val="14"/>
-              </w:rPr>
-              <w:t>_pro</w:t>
-            </w:r>
-            <w:r>
-              <w:rPr>
-                <w:rFonts w:ascii="Times New Roman" w:hAnsi="Times New Roman"/>
-                <w:color w:val="000000" w:themeColor="text1"/>
-                <w:sz w:val="14"/>
-                <w:szCs w:val="14"/>
-              </w:rPr>
-              <w:t xml:space="preserve"> }}</w:t>
+              <w:t/>
+            </w:r>
+            <w:r>
+              <w:rPr>
+                <w:rFonts w:ascii="Times New Roman" w:hAnsi="Times New Roman"/>
+                <w:color w:val="000000" w:themeColor="text1"/>
+                <w:sz w:val="14"/>
+                <w:szCs w:val="14"/>
+              </w:rPr>
+              <w:t/>
+            </w:r>
+            <w:r>
+              <w:rPr>
+                <w:rFonts w:ascii="Times New Roman" w:hAnsi="Times New Roman"/>
+                <w:color w:val="000000" w:themeColor="text1"/>
+                <w:sz w:val="14"/>
+                <w:szCs w:val="14"/>
+              </w:rPr>
+              <w:t/>
+            </w:r>
+            <w:r>
+              <w:rPr>
+                <w:rFonts w:ascii="Times New Roman" w:hAnsi="Times New Roman"/>
+                <w:color w:val="000000" w:themeColor="text1"/>
+                <w:sz w:val="14"/>
+                <w:szCs w:val="14"/>
+              </w:rPr>
+              <w:t xml:space="preserve"/>
             </w:r>
           </w:p>
         </w:tc>
@@ -3927,16 +3927,16 @@
                 <w:sz w:val="14"/>
                 <w:szCs w:val="14"/>
               </w:rPr>
-              <w:t xml:space="preserve"> </w:t>
-            </w:r>
-            <w:r>
-              <w:rPr>
-                <w:rFonts w:ascii="Times New Roman" w:hAnsi="Times New Roman"/>
-                <w:color w:val="000000" w:themeColor="text1"/>
-                <w:sz w:val="14"/>
-                <w:szCs w:val="14"/>
-              </w:rPr>
-              <w:t>{{ test_date }}</w:t>
+              <w:t xml:space="preserve" w:space="preserve"> {{ pro_test_date }}</w:t>
+            </w:r>
+            <w:r>
+              <w:rPr>
+                <w:rFonts w:ascii="Times New Roman" w:hAnsi="Times New Roman"/>
+                <w:color w:val="000000" w:themeColor="text1"/>
+                <w:sz w:val="14"/>
+                <w:szCs w:val="14"/>
+              </w:rPr>
+              <w:t/>
             </w:r>
           </w:p>
         </w:tc>
@@ -3974,16 +3974,16 @@
                 <w:sz w:val="14"/>
                 <w:szCs w:val="14"/>
               </w:rPr>
-              <w:t>{{ analyst_initial }}</w:t>
-            </w:r>
-            <w:r>
-              <w:rPr>
-                <w:rFonts w:ascii="Times New Roman" w:hAnsi="Times New Roman"/>
-                <w:color w:val="000000" w:themeColor="text1"/>
-                <w:sz w:val="14"/>
-                <w:szCs w:val="14"/>
-              </w:rPr>
-              <w:t xml:space="preserve"> </w:t>
+              <w:t w:space="preserve" xml:space="preserve">{{ pro_analyst_initial }} </w:t>
+            </w:r>
+            <w:r>
+              <w:rPr>
+                <w:rFonts w:ascii="Times New Roman" w:hAnsi="Times New Roman"/>
+                <w:color w:val="000000" w:themeColor="text1"/>
+                <w:sz w:val="14"/>
+                <w:szCs w:val="14"/>
+              </w:rPr>
+              <w:t xml:space="preserve"/>
             </w:r>
           </w:p>
         </w:tc>
@@ -4052,25 +4052,25 @@
                 <w:sz w:val="14"/>
                 <w:szCs w:val="14"/>
               </w:rPr>
-              <w:t>{{ obs_sett_dur</w:t>
-            </w:r>
-            <w:r>
-              <w:rPr>
-                <w:rFonts w:ascii="Times New Roman" w:hAnsi="Times New Roman"/>
-                <w:color w:val="000000" w:themeColor="text1"/>
-                <w:sz w:val="14"/>
-                <w:szCs w:val="14"/>
-              </w:rPr>
-              <w:t>_pro</w:t>
-            </w:r>
-            <w:r>
-              <w:rPr>
-                <w:rFonts w:ascii="Times New Roman" w:hAnsi="Times New Roman"/>
-                <w:color w:val="000000" w:themeColor="text1"/>
-                <w:sz w:val="14"/>
-                <w:szCs w:val="14"/>
-              </w:rPr>
-              <w:t xml:space="preserve"> }}</w:t>
+              <w:t w:space="preserve" xml:space="preserve">{{ pro_obs_sett_dur_pro }}</w:t>
+            </w:r>
+            <w:r>
+              <w:rPr>
+                <w:rFonts w:ascii="Times New Roman" w:hAnsi="Times New Roman"/>
+                <w:color w:val="000000" w:themeColor="text1"/>
+                <w:sz w:val="14"/>
+                <w:szCs w:val="14"/>
+              </w:rPr>
+              <w:t/>
+            </w:r>
+            <w:r>
+              <w:rPr>
+                <w:rFonts w:ascii="Times New Roman" w:hAnsi="Times New Roman"/>
+                <w:color w:val="000000" w:themeColor="text1"/>
+                <w:sz w:val="14"/>
+                <w:szCs w:val="14"/>
+              </w:rPr>
+              <w:t xml:space="preserve"/>
             </w:r>
           </w:p>
         </w:tc>
@@ -4106,25 +4106,25 @@
                 <w:sz w:val="14"/>
                 <w:szCs w:val="14"/>
               </w:rPr>
-              <w:t>{{ etx_sett_dur</w:t>
-            </w:r>
-            <w:r>
-              <w:rPr>
-                <w:rFonts w:ascii="Times New Roman" w:hAnsi="Times New Roman"/>
-                <w:color w:val="000000" w:themeColor="text1"/>
-                <w:sz w:val="14"/>
-                <w:szCs w:val="14"/>
-              </w:rPr>
-              <w:t>_pro</w:t>
-            </w:r>
-            <w:r>
-              <w:rPr>
-                <w:rFonts w:ascii="Times New Roman" w:hAnsi="Times New Roman"/>
-                <w:color w:val="000000" w:themeColor="text1"/>
-                <w:sz w:val="14"/>
-                <w:szCs w:val="14"/>
-              </w:rPr>
-              <w:t xml:space="preserve"> }}</w:t>
+              <w:t w:space="preserve" xml:space="preserve">{{ pro_etx_sett_dur_pro }}</w:t>
+            </w:r>
+            <w:r>
+              <w:rPr>
+                <w:rFonts w:ascii="Times New Roman" w:hAnsi="Times New Roman"/>
+                <w:color w:val="000000" w:themeColor="text1"/>
+                <w:sz w:val="14"/>
+                <w:szCs w:val="14"/>
+              </w:rPr>
+              <w:t/>
+            </w:r>
+            <w:r>
+              <w:rPr>
+                <w:rFonts w:ascii="Times New Roman" w:hAnsi="Times New Roman"/>
+                <w:color w:val="000000" w:themeColor="text1"/>
+                <w:sz w:val="14"/>
+                <w:szCs w:val="14"/>
+              </w:rPr>
+              <w:t xml:space="preserve"/>
             </w:r>
           </w:p>
         </w:tc>
@@ -4160,25 +4160,25 @@
                 <w:sz w:val="14"/>
                 <w:szCs w:val="14"/>
               </w:rPr>
-              <w:t>{{ id_sett_dur</w:t>
-            </w:r>
-            <w:r>
-              <w:rPr>
-                <w:rFonts w:ascii="Times New Roman" w:hAnsi="Times New Roman"/>
-                <w:color w:val="000000" w:themeColor="text1"/>
-                <w:sz w:val="14"/>
-                <w:szCs w:val="14"/>
-              </w:rPr>
-              <w:t>_pro</w:t>
-            </w:r>
-            <w:r>
-              <w:rPr>
-                <w:rFonts w:ascii="Times New Roman" w:hAnsi="Times New Roman"/>
-                <w:color w:val="000000" w:themeColor="text1"/>
-                <w:sz w:val="14"/>
-                <w:szCs w:val="14"/>
-              </w:rPr>
-              <w:t xml:space="preserve"> }}</w:t>
+              <w:t w:space="preserve" xml:space="preserve">{{ pro_id_sett_dur_pro }}</w:t>
+            </w:r>
+            <w:r>
+              <w:rPr>
+                <w:rFonts w:ascii="Times New Roman" w:hAnsi="Times New Roman"/>
+                <w:color w:val="000000" w:themeColor="text1"/>
+                <w:sz w:val="14"/>
+                <w:szCs w:val="14"/>
+              </w:rPr>
+              <w:t/>
+            </w:r>
+            <w:r>
+              <w:rPr>
+                <w:rFonts w:ascii="Times New Roman" w:hAnsi="Times New Roman"/>
+                <w:color w:val="000000" w:themeColor="text1"/>
+                <w:sz w:val="14"/>
+                <w:szCs w:val="14"/>
+              </w:rPr>
+              <w:t xml:space="preserve"/>
             </w:r>
           </w:p>
         </w:tc>
@@ -4321,16 +4321,16 @@
                 <w:sz w:val="14"/>
                 <w:szCs w:val="14"/>
               </w:rPr>
-              <w:t xml:space="preserve"> </w:t>
-            </w:r>
-            <w:r>
-              <w:rPr>
-                <w:rFonts w:ascii="Times New Roman" w:hAnsi="Times New Roman"/>
-                <w:color w:val="000000" w:themeColor="text1"/>
-                <w:sz w:val="14"/>
-                <w:szCs w:val="14"/>
-              </w:rPr>
-              <w:t>{{ after_test }}</w:t>
+              <w:t xml:space="preserve" w:space="preserve"> {{ pro_after_test }}</w:t>
+            </w:r>
+            <w:r>
+              <w:rPr>
+                <w:rFonts w:ascii="Times New Roman" w:hAnsi="Times New Roman"/>
+                <w:color w:val="000000" w:themeColor="text1"/>
+                <w:sz w:val="14"/>
+                <w:szCs w:val="14"/>
+              </w:rPr>
+              <w:t/>
             </w:r>
           </w:p>
         </w:tc>
@@ -4368,16 +4368,16 @@
                 <w:sz w:val="14"/>
                 <w:szCs w:val="14"/>
               </w:rPr>
-              <w:t>{{ analyst_initial }}</w:t>
-            </w:r>
-            <w:r>
-              <w:rPr>
-                <w:rFonts w:ascii="Times New Roman" w:hAnsi="Times New Roman"/>
-                <w:color w:val="000000" w:themeColor="text1"/>
-                <w:sz w:val="14"/>
-                <w:szCs w:val="14"/>
-              </w:rPr>
-              <w:t xml:space="preserve"> </w:t>
+              <w:t w:space="preserve" xml:space="preserve">{{ pro_analyst_initial }} </w:t>
+            </w:r>
+            <w:r>
+              <w:rPr>
+                <w:rFonts w:ascii="Times New Roman" w:hAnsi="Times New Roman"/>
+                <w:color w:val="000000" w:themeColor="text1"/>
+                <w:sz w:val="14"/>
+                <w:szCs w:val="14"/>
+              </w:rPr>
+              <w:t xml:space="preserve"/>
             </w:r>
           </w:p>
         </w:tc>
@@ -4446,7 +4446,7 @@
                 <w:sz w:val="14"/>
                 <w:szCs w:val="14"/>
               </w:rPr>
-              <w:t xml:space="preserve">{{ </w:t>
+              <w:t xml:space="preserve" w:space="preserve">{{ pro_af_obs_sett_dur_pro }}</w:t>
             </w:r>
             <w:r>
               <w:rPr>
@@ -4456,34 +4456,34 @@
                 <w:szCs w:val="14"/>
                 <w:lang w:eastAsia="zh-CN"/>
               </w:rPr>
-              <w:t>af_</w:t>
-            </w:r>
-            <w:r>
-              <w:rPr>
-                <w:rFonts w:ascii="Times New Roman" w:hAnsi="Times New Roman"/>
-                <w:color w:val="000000" w:themeColor="text1"/>
-                <w:sz w:val="14"/>
-                <w:szCs w:val="14"/>
-              </w:rPr>
-              <w:t>obs_sett_dur</w:t>
-            </w:r>
-            <w:r>
-              <w:rPr>
-                <w:rFonts w:ascii="Times New Roman" w:hAnsi="Times New Roman"/>
-                <w:color w:val="000000" w:themeColor="text1"/>
-                <w:sz w:val="14"/>
-                <w:szCs w:val="14"/>
-              </w:rPr>
-              <w:t>_pro</w:t>
-            </w:r>
-            <w:r>
-              <w:rPr>
-                <w:rFonts w:ascii="Times New Roman" w:hAnsi="Times New Roman"/>
-                <w:color w:val="000000" w:themeColor="text1"/>
-                <w:sz w:val="14"/>
-                <w:szCs w:val="14"/>
-              </w:rPr>
-              <w:t xml:space="preserve"> }}</w:t>
+              <w:t/>
+            </w:r>
+            <w:r>
+              <w:rPr>
+                <w:rFonts w:ascii="Times New Roman" w:hAnsi="Times New Roman"/>
+                <w:color w:val="000000" w:themeColor="text1"/>
+                <w:sz w:val="14"/>
+                <w:szCs w:val="14"/>
+              </w:rPr>
+              <w:t/>
+            </w:r>
+            <w:r>
+              <w:rPr>
+                <w:rFonts w:ascii="Times New Roman" w:hAnsi="Times New Roman"/>
+                <w:color w:val="000000" w:themeColor="text1"/>
+                <w:sz w:val="14"/>
+                <w:szCs w:val="14"/>
+              </w:rPr>
+              <w:t/>
+            </w:r>
+            <w:r>
+              <w:rPr>
+                <w:rFonts w:ascii="Times New Roman" w:hAnsi="Times New Roman"/>
+                <w:color w:val="000000" w:themeColor="text1"/>
+                <w:sz w:val="14"/>
+                <w:szCs w:val="14"/>
+              </w:rPr>
+              <w:t xml:space="preserve"/>
             </w:r>
           </w:p>
         </w:tc>
@@ -4511,7 +4511,7 @@
                 <w:sz w:val="14"/>
                 <w:szCs w:val="14"/>
               </w:rPr>
-              <w:t xml:space="preserve">{{ </w:t>
+              <w:t xml:space="preserve" w:space="preserve">{{ pro_af_etx_sett_dur_pro }}</w:t>
             </w:r>
             <w:r>
               <w:rPr>
@@ -4521,34 +4521,34 @@
                 <w:szCs w:val="14"/>
                 <w:lang w:eastAsia="zh-CN"/>
               </w:rPr>
-              <w:t>af_</w:t>
-            </w:r>
-            <w:r>
-              <w:rPr>
-                <w:rFonts w:ascii="Times New Roman" w:hAnsi="Times New Roman"/>
-                <w:color w:val="000000" w:themeColor="text1"/>
-                <w:sz w:val="14"/>
-                <w:szCs w:val="14"/>
-              </w:rPr>
-              <w:t>etx_sett_dur</w:t>
-            </w:r>
-            <w:r>
-              <w:rPr>
-                <w:rFonts w:ascii="Times New Roman" w:hAnsi="Times New Roman"/>
-                <w:color w:val="000000" w:themeColor="text1"/>
-                <w:sz w:val="14"/>
-                <w:szCs w:val="14"/>
-              </w:rPr>
-              <w:t>_pro</w:t>
-            </w:r>
-            <w:r>
-              <w:rPr>
-                <w:rFonts w:ascii="Times New Roman" w:hAnsi="Times New Roman"/>
-                <w:color w:val="000000" w:themeColor="text1"/>
-                <w:sz w:val="14"/>
-                <w:szCs w:val="14"/>
-              </w:rPr>
-              <w:t xml:space="preserve"> }}</w:t>
+              <w:t/>
+            </w:r>
+            <w:r>
+              <w:rPr>
+                <w:rFonts w:ascii="Times New Roman" w:hAnsi="Times New Roman"/>
+                <w:color w:val="000000" w:themeColor="text1"/>
+                <w:sz w:val="14"/>
+                <w:szCs w:val="14"/>
+              </w:rPr>
+              <w:t/>
+            </w:r>
+            <w:r>
+              <w:rPr>
+                <w:rFonts w:ascii="Times New Roman" w:hAnsi="Times New Roman"/>
+                <w:color w:val="000000" w:themeColor="text1"/>
+                <w:sz w:val="14"/>
+                <w:szCs w:val="14"/>
+              </w:rPr>
+              <w:t/>
+            </w:r>
+            <w:r>
+              <w:rPr>
+                <w:rFonts w:ascii="Times New Roman" w:hAnsi="Times New Roman"/>
+                <w:color w:val="000000" w:themeColor="text1"/>
+                <w:sz w:val="14"/>
+                <w:szCs w:val="14"/>
+              </w:rPr>
+              <w:t xml:space="preserve"/>
             </w:r>
           </w:p>
         </w:tc>
@@ -4576,7 +4576,7 @@
                 <w:sz w:val="14"/>
                 <w:szCs w:val="14"/>
               </w:rPr>
-              <w:t xml:space="preserve">{{ </w:t>
+              <w:t xml:space="preserve" w:space="preserve">{{ pro_af_id_sett_dur_pro }}</w:t>
             </w:r>
             <w:r>
               <w:rPr>
@@ -4586,34 +4586,34 @@
                 <w:szCs w:val="14"/>
                 <w:lang w:eastAsia="zh-CN"/>
               </w:rPr>
-              <w:t>af_</w:t>
-            </w:r>
-            <w:r>
-              <w:rPr>
-                <w:rFonts w:ascii="Times New Roman" w:hAnsi="Times New Roman"/>
-                <w:color w:val="000000" w:themeColor="text1"/>
-                <w:sz w:val="14"/>
-                <w:szCs w:val="14"/>
-              </w:rPr>
-              <w:t>id_sett_dur</w:t>
-            </w:r>
-            <w:r>
-              <w:rPr>
-                <w:rFonts w:ascii="Times New Roman" w:hAnsi="Times New Roman"/>
-                <w:color w:val="000000" w:themeColor="text1"/>
-                <w:sz w:val="14"/>
-                <w:szCs w:val="14"/>
-              </w:rPr>
-              <w:t>_pro</w:t>
-            </w:r>
-            <w:r>
-              <w:rPr>
-                <w:rFonts w:ascii="Times New Roman" w:hAnsi="Times New Roman"/>
-                <w:color w:val="000000" w:themeColor="text1"/>
-                <w:sz w:val="14"/>
-                <w:szCs w:val="14"/>
-              </w:rPr>
-              <w:t xml:space="preserve"> }}</w:t>
+              <w:t/>
+            </w:r>
+            <w:r>
+              <w:rPr>
+                <w:rFonts w:ascii="Times New Roman" w:hAnsi="Times New Roman"/>
+                <w:color w:val="000000" w:themeColor="text1"/>
+                <w:sz w:val="14"/>
+                <w:szCs w:val="14"/>
+              </w:rPr>
+              <w:t/>
+            </w:r>
+            <w:r>
+              <w:rPr>
+                <w:rFonts w:ascii="Times New Roman" w:hAnsi="Times New Roman"/>
+                <w:color w:val="000000" w:themeColor="text1"/>
+                <w:sz w:val="14"/>
+                <w:szCs w:val="14"/>
+              </w:rPr>
+              <w:t/>
+            </w:r>
+            <w:r>
+              <w:rPr>
+                <w:rFonts w:ascii="Times New Roman" w:hAnsi="Times New Roman"/>
+                <w:color w:val="000000" w:themeColor="text1"/>
+                <w:sz w:val="14"/>
+                <w:szCs w:val="14"/>
+              </w:rPr>
+              <w:t xml:space="preserve"/>
             </w:r>
           </w:p>
         </w:tc>
@@ -4773,7 +4773,7 @@
                 <w:sz w:val="14"/>
                 <w:szCs w:val="14"/>
               </w:rPr>
-              <w:t>{{ date_of_weekly }}</w:t>
+              <w:t w:space="preserve" xml:space="preserve">{{ pro_date_of_weekly }}</w:t>
             </w:r>
           </w:p>
         </w:tc>
@@ -4861,7 +4861,7 @@
                 <w:sz w:val="14"/>
                 <w:szCs w:val="14"/>
               </w:rPr>
-              <w:t>{{ obs_air_wk_of }}</w:t>
+              <w:t w:space="preserve" xml:space="preserve">{{ pro_obs_air_wk_of }}</w:t>
             </w:r>
           </w:p>
         </w:tc>
@@ -4892,7 +4892,7 @@
                 <w:sz w:val="14"/>
                 <w:szCs w:val="14"/>
               </w:rPr>
-              <w:t>{{ etx_air_wk_of }}</w:t>
+              <w:t w:space="preserve" xml:space="preserve">{{ pro_etx_air_wk_of }}</w:t>
             </w:r>
           </w:p>
         </w:tc>
@@ -4924,7 +4924,7 @@
                 <w:sz w:val="14"/>
                 <w:szCs w:val="14"/>
               </w:rPr>
-              <w:t>{{ id_air_wk_of }}</w:t>
+              <w:t w:space="preserve" xml:space="preserve">{{ pro_id_air_wk_of }}</w:t>
             </w:r>
           </w:p>
         </w:tc>
@@ -5044,7 +5044,7 @@
                 <w:sz w:val="14"/>
                 <w:szCs w:val="14"/>
               </w:rPr>
-              <w:t>{{ date_of_weekly }}</w:t>
+              <w:t w:space="preserve" xml:space="preserve">{{ pro_date_of_weekly }}</w:t>
             </w:r>
           </w:p>
         </w:tc>
@@ -5127,7 +5127,7 @@
                 <w:sz w:val="14"/>
                 <w:szCs w:val="14"/>
               </w:rPr>
-              <w:t>{{ obs_air_wk_of }}</w:t>
+              <w:t w:space="preserve" xml:space="preserve">{{ pro_obs_air_wk_of }}</w:t>
             </w:r>
           </w:p>
         </w:tc>
@@ -5158,7 +5158,7 @@
                 <w:sz w:val="14"/>
                 <w:szCs w:val="14"/>
               </w:rPr>
-              <w:t>{{ etx_air_wk_of }}</w:t>
+              <w:t w:space="preserve" xml:space="preserve">{{ pro_etx_air_wk_of }}</w:t>
             </w:r>
           </w:p>
         </w:tc>
@@ -5190,7 +5190,7 @@
                 <w:sz w:val="14"/>
                 <w:szCs w:val="14"/>
               </w:rPr>
-              <w:t>{{ id_air_wk_of }}</w:t>
+              <w:t w:space="preserve" xml:space="preserve">{{ pro_id_air_wk_of }}</w:t>
             </w:r>
           </w:p>
         </w:tc>
@@ -5430,7 +5430,7 @@
                 <w:sz w:val="14"/>
                 <w:szCs w:val="14"/>
               </w:rPr>
-              <w:t>{{ obs_room_wk_of }}</w:t>
+              <w:t w:space="preserve" xml:space="preserve">{{ pro_obs_room_wk_of }}</w:t>
             </w:r>
           </w:p>
         </w:tc>
@@ -5461,7 +5461,7 @@
                 <w:sz w:val="14"/>
                 <w:szCs w:val="14"/>
               </w:rPr>
-              <w:t>{{ etx_room_wk_of }}</w:t>
+              <w:t w:space="preserve" xml:space="preserve">{{ pro_etx_room_wk_of }}</w:t>
             </w:r>
           </w:p>
         </w:tc>
@@ -5493,7 +5493,7 @@
                 <w:sz w:val="14"/>
                 <w:szCs w:val="14"/>
               </w:rPr>
-              <w:t>{{ id_room_wk_of }}</w:t>
+              <w:t w:space="preserve" xml:space="preserve">{{ pro_id_room_wk_of }}</w:t>
             </w:r>
           </w:p>
         </w:tc>
@@ -5696,7 +5696,7 @@
                 <w:sz w:val="14"/>
                 <w:szCs w:val="14"/>
               </w:rPr>
-              <w:t>{{ obs_room_wk_of }}</w:t>
+              <w:t w:space="preserve" xml:space="preserve">{{ pro_obs_room_wk_of }}</w:t>
             </w:r>
           </w:p>
         </w:tc>
@@ -5727,7 +5727,7 @@
                 <w:sz w:val="14"/>
                 <w:szCs w:val="14"/>
               </w:rPr>
-              <w:t>{{ etx_room_wk_of }}</w:t>
+              <w:t w:space="preserve" xml:space="preserve">{{ pro_etx_room_wk_of }}</w:t>
             </w:r>
           </w:p>
         </w:tc>
@@ -5759,7 +5759,7 @@
                 <w:sz w:val="14"/>
                 <w:szCs w:val="14"/>
               </w:rPr>
-              <w:t>{{ id_room_wk_of }}</w:t>
+              <w:t w:space="preserve" xml:space="preserve">{{ pro_id_room_wk_of }}</w:t>
             </w:r>
           </w:p>
         </w:tc>
@@ -5836,7 +5836,7 @@
           <w:szCs w:val="18"/>
           <w:u w:val="single"/>
         </w:rPr>
-        <w:t xml:space="preserve">Table </w:t>
+        <w:t xml:space="preserve" w:space="preserve">Table 3: Environmental Monitoring from Aliquoting Performed on {{ alq_test_date }}</w:t>
       </w:r>
       <w:r>
         <w:rPr>
@@ -5848,7 +5848,7 @@
           <w:u w:val="single"/>
           <w:lang w:eastAsia="zh-CN"/>
         </w:rPr>
-        <w:t>3</w:t>
+        <w:t/>
       </w:r>
       <w:r>
         <w:rPr>
@@ -5859,7 +5859,7 @@
           <w:szCs w:val="18"/>
           <w:u w:val="single"/>
         </w:rPr>
-        <w:t xml:space="preserve">: </w:t>
+        <w:t xml:space="preserve"/>
       </w:r>
       <w:r>
         <w:rPr>
@@ -5869,7 +5869,7 @@
           <w:szCs w:val="18"/>
           <w:u w:val="single"/>
         </w:rPr>
-        <w:t>Environmental Monitoring from</w:t>
+        <w:t/>
       </w:r>
       <w:r>
         <w:rPr>
@@ -5879,7 +5879,7 @@
           <w:szCs w:val="18"/>
           <w:u w:val="single"/>
         </w:rPr>
-        <w:t xml:space="preserve"> </w:t>
+        <w:t xml:space="preserve"/>
       </w:r>
       <w:r>
         <w:rPr>
@@ -5890,7 +5890,7 @@
           <w:u w:val="single"/>
           <w:lang w:eastAsia="zh-CN"/>
         </w:rPr>
-        <w:t>Aliquoting</w:t>
+        <w:t/>
       </w:r>
       <w:r>
         <w:rPr>
@@ -5900,7 +5900,7 @@
           <w:szCs w:val="18"/>
           <w:u w:val="single"/>
         </w:rPr>
-        <w:t xml:space="preserve"> Performed on </w:t>
+        <w:t xml:space="preserve"/>
       </w:r>
       <w:r>
         <w:rPr>
@@ -5910,7 +5910,7 @@
           <w:szCs w:val="18"/>
           <w:u w:val="single"/>
         </w:rPr>
-        <w:t>{{ test_date }}</w:t>
+        <w:t/>
       </w:r>
     </w:p>
     <w:p>
@@ -6372,7 +6372,7 @@
                 <w:sz w:val="14"/>
                 <w:szCs w:val="14"/>
               </w:rPr>
-              <w:t>{{ before_test }}</w:t>
+              <w:t w:space="preserve" xml:space="preserve">{{ alq_before_test }}</w:t>
             </w:r>
           </w:p>
         </w:tc>
@@ -6410,7 +6410,7 @@
                 <w:sz w:val="14"/>
                 <w:szCs w:val="14"/>
               </w:rPr>
-              <w:t>{{ analyst_initial }}</w:t>
+              <w:t w:space="preserve" xml:space="preserve">{{ alq_analyst_initial }}</w:t>
             </w:r>
           </w:p>
         </w:tc>
@@ -6479,7 +6479,7 @@
                 <w:sz w:val="14"/>
                 <w:szCs w:val="14"/>
               </w:rPr>
-              <w:t>{{ be_obs_pers_dur_pro }}</w:t>
+              <w:t w:space="preserve" xml:space="preserve">{{ alq_be_obs_pers_dur_pro }}</w:t>
             </w:r>
           </w:p>
         </w:tc>
@@ -6507,43 +6507,43 @@
                 <w:sz w:val="14"/>
                 <w:szCs w:val="14"/>
               </w:rPr>
-              <w:t xml:space="preserve">{{ </w:t>
-            </w:r>
-            <w:r>
-              <w:rPr>
-                <w:rFonts w:ascii="Times New Roman" w:hAnsi="Times New Roman"/>
-                <w:color w:val="000000" w:themeColor="text1"/>
-                <w:sz w:val="14"/>
-                <w:szCs w:val="14"/>
-              </w:rPr>
-              <w:t>be_</w:t>
-            </w:r>
-            <w:r>
-              <w:rPr>
-                <w:rFonts w:ascii="Times New Roman" w:hAnsi="Times New Roman"/>
-                <w:color w:val="000000" w:themeColor="text1"/>
-                <w:sz w:val="14"/>
-                <w:szCs w:val="14"/>
-              </w:rPr>
-              <w:t>etx_pers_dur</w:t>
-            </w:r>
-            <w:r>
-              <w:rPr>
-                <w:rFonts w:ascii="Times New Roman" w:hAnsi="Times New Roman"/>
-                <w:color w:val="000000" w:themeColor="text1"/>
-                <w:sz w:val="14"/>
-                <w:szCs w:val="14"/>
-              </w:rPr>
-              <w:t>_pro</w:t>
-            </w:r>
-            <w:r>
-              <w:rPr>
-                <w:rFonts w:ascii="Times New Roman" w:hAnsi="Times New Roman"/>
-                <w:color w:val="000000" w:themeColor="text1"/>
-                <w:sz w:val="14"/>
-                <w:szCs w:val="14"/>
-              </w:rPr>
-              <w:t xml:space="preserve"> }}</w:t>
+              <w:t xml:space="preserve" w:space="preserve">{{ alq_be_etx_pers_dur_pro }}</w:t>
+            </w:r>
+            <w:r>
+              <w:rPr>
+                <w:rFonts w:ascii="Times New Roman" w:hAnsi="Times New Roman"/>
+                <w:color w:val="000000" w:themeColor="text1"/>
+                <w:sz w:val="14"/>
+                <w:szCs w:val="14"/>
+              </w:rPr>
+              <w:t/>
+            </w:r>
+            <w:r>
+              <w:rPr>
+                <w:rFonts w:ascii="Times New Roman" w:hAnsi="Times New Roman"/>
+                <w:color w:val="000000" w:themeColor="text1"/>
+                <w:sz w:val="14"/>
+                <w:szCs w:val="14"/>
+              </w:rPr>
+              <w:t/>
+            </w:r>
+            <w:r>
+              <w:rPr>
+                <w:rFonts w:ascii="Times New Roman" w:hAnsi="Times New Roman"/>
+                <w:color w:val="000000" w:themeColor="text1"/>
+                <w:sz w:val="14"/>
+                <w:szCs w:val="14"/>
+              </w:rPr>
+              <w:t/>
+            </w:r>
+            <w:r>
+              <w:rPr>
+                <w:rFonts w:ascii="Times New Roman" w:hAnsi="Times New Roman"/>
+                <w:color w:val="000000" w:themeColor="text1"/>
+                <w:sz w:val="14"/>
+                <w:szCs w:val="14"/>
+              </w:rPr>
+              <w:t xml:space="preserve"/>
             </w:r>
           </w:p>
         </w:tc>
@@ -6571,43 +6571,43 @@
                 <w:sz w:val="14"/>
                 <w:szCs w:val="14"/>
               </w:rPr>
-              <w:t xml:space="preserve">{{ </w:t>
-            </w:r>
-            <w:r>
-              <w:rPr>
-                <w:rFonts w:ascii="Times New Roman" w:hAnsi="Times New Roman"/>
-                <w:color w:val="000000" w:themeColor="text1"/>
-                <w:sz w:val="14"/>
-                <w:szCs w:val="14"/>
-              </w:rPr>
-              <w:t>be_</w:t>
-            </w:r>
-            <w:r>
-              <w:rPr>
-                <w:rFonts w:ascii="Times New Roman" w:hAnsi="Times New Roman"/>
-                <w:color w:val="000000" w:themeColor="text1"/>
-                <w:sz w:val="14"/>
-                <w:szCs w:val="14"/>
-              </w:rPr>
-              <w:t>id_pers_dur</w:t>
-            </w:r>
-            <w:r>
-              <w:rPr>
-                <w:rFonts w:ascii="Times New Roman" w:hAnsi="Times New Roman"/>
-                <w:color w:val="000000" w:themeColor="text1"/>
-                <w:sz w:val="14"/>
-                <w:szCs w:val="14"/>
-              </w:rPr>
-              <w:t>_pro</w:t>
-            </w:r>
-            <w:r>
-              <w:rPr>
-                <w:rFonts w:ascii="Times New Roman" w:hAnsi="Times New Roman"/>
-                <w:color w:val="000000" w:themeColor="text1"/>
-                <w:sz w:val="14"/>
-                <w:szCs w:val="14"/>
-              </w:rPr>
-              <w:t xml:space="preserve"> }}</w:t>
+              <w:t xml:space="preserve" w:space="preserve">{{ alq_be_id_pers_dur_pro }}</w:t>
+            </w:r>
+            <w:r>
+              <w:rPr>
+                <w:rFonts w:ascii="Times New Roman" w:hAnsi="Times New Roman"/>
+                <w:color w:val="000000" w:themeColor="text1"/>
+                <w:sz w:val="14"/>
+                <w:szCs w:val="14"/>
+              </w:rPr>
+              <w:t/>
+            </w:r>
+            <w:r>
+              <w:rPr>
+                <w:rFonts w:ascii="Times New Roman" w:hAnsi="Times New Roman"/>
+                <w:color w:val="000000" w:themeColor="text1"/>
+                <w:sz w:val="14"/>
+                <w:szCs w:val="14"/>
+              </w:rPr>
+              <w:t/>
+            </w:r>
+            <w:r>
+              <w:rPr>
+                <w:rFonts w:ascii="Times New Roman" w:hAnsi="Times New Roman"/>
+                <w:color w:val="000000" w:themeColor="text1"/>
+                <w:sz w:val="14"/>
+                <w:szCs w:val="14"/>
+              </w:rPr>
+              <w:t/>
+            </w:r>
+            <w:r>
+              <w:rPr>
+                <w:rFonts w:ascii="Times New Roman" w:hAnsi="Times New Roman"/>
+                <w:color w:val="000000" w:themeColor="text1"/>
+                <w:sz w:val="14"/>
+                <w:szCs w:val="14"/>
+              </w:rPr>
+              <w:t xml:space="preserve"/>
             </w:r>
           </w:p>
         </w:tc>
@@ -6750,16 +6750,16 @@
                 <w:sz w:val="14"/>
                 <w:szCs w:val="14"/>
               </w:rPr>
-              <w:t xml:space="preserve"> </w:t>
-            </w:r>
-            <w:r>
-              <w:rPr>
-                <w:rFonts w:ascii="Times New Roman" w:hAnsi="Times New Roman"/>
-                <w:color w:val="000000" w:themeColor="text1"/>
-                <w:sz w:val="14"/>
-                <w:szCs w:val="14"/>
-              </w:rPr>
-              <w:t>{{ test_date }}</w:t>
+              <w:t xml:space="preserve" w:space="preserve"> {{ alq_test_date }}</w:t>
+            </w:r>
+            <w:r>
+              <w:rPr>
+                <w:rFonts w:ascii="Times New Roman" w:hAnsi="Times New Roman"/>
+                <w:color w:val="000000" w:themeColor="text1"/>
+                <w:sz w:val="14"/>
+                <w:szCs w:val="14"/>
+              </w:rPr>
+              <w:t/>
             </w:r>
           </w:p>
         </w:tc>
@@ -6797,16 +6797,16 @@
                 <w:sz w:val="14"/>
                 <w:szCs w:val="14"/>
               </w:rPr>
-              <w:t>{{ analyst_initial }}</w:t>
-            </w:r>
-            <w:r>
-              <w:rPr>
-                <w:rFonts w:ascii="Times New Roman" w:hAnsi="Times New Roman"/>
-                <w:color w:val="000000" w:themeColor="text1"/>
-                <w:sz w:val="14"/>
-                <w:szCs w:val="14"/>
-              </w:rPr>
-              <w:t xml:space="preserve"> </w:t>
+              <w:t w:space="preserve" xml:space="preserve">{{ alq_analyst_initial }} </w:t>
+            </w:r>
+            <w:r>
+              <w:rPr>
+                <w:rFonts w:ascii="Times New Roman" w:hAnsi="Times New Roman"/>
+                <w:color w:val="000000" w:themeColor="text1"/>
+                <w:sz w:val="14"/>
+                <w:szCs w:val="14"/>
+              </w:rPr>
+              <w:t xml:space="preserve"/>
             </w:r>
           </w:p>
         </w:tc>
@@ -6875,7 +6875,7 @@
                 <w:sz w:val="14"/>
                 <w:szCs w:val="14"/>
               </w:rPr>
-              <w:t>{{ obs_pers_dur_pro }}</w:t>
+              <w:t w:space="preserve" xml:space="preserve">{{ alq_obs_pers_dur_pro }}</w:t>
             </w:r>
           </w:p>
         </w:tc>
@@ -6911,25 +6911,25 @@
                 <w:sz w:val="14"/>
                 <w:szCs w:val="14"/>
               </w:rPr>
-              <w:t>{{ etx_pers_dur</w:t>
-            </w:r>
-            <w:r>
-              <w:rPr>
-                <w:rFonts w:ascii="Times New Roman" w:hAnsi="Times New Roman"/>
-                <w:color w:val="000000" w:themeColor="text1"/>
-                <w:sz w:val="14"/>
-                <w:szCs w:val="14"/>
-              </w:rPr>
-              <w:t>_pro</w:t>
-            </w:r>
-            <w:r>
-              <w:rPr>
-                <w:rFonts w:ascii="Times New Roman" w:hAnsi="Times New Roman"/>
-                <w:color w:val="000000" w:themeColor="text1"/>
-                <w:sz w:val="14"/>
-                <w:szCs w:val="14"/>
-              </w:rPr>
-              <w:t xml:space="preserve"> }}</w:t>
+              <w:t w:space="preserve" xml:space="preserve">{{ alq_etx_pers_dur_pro }}</w:t>
+            </w:r>
+            <w:r>
+              <w:rPr>
+                <w:rFonts w:ascii="Times New Roman" w:hAnsi="Times New Roman"/>
+                <w:color w:val="000000" w:themeColor="text1"/>
+                <w:sz w:val="14"/>
+                <w:szCs w:val="14"/>
+              </w:rPr>
+              <w:t/>
+            </w:r>
+            <w:r>
+              <w:rPr>
+                <w:rFonts w:ascii="Times New Roman" w:hAnsi="Times New Roman"/>
+                <w:color w:val="000000" w:themeColor="text1"/>
+                <w:sz w:val="14"/>
+                <w:szCs w:val="14"/>
+              </w:rPr>
+              <w:t xml:space="preserve"/>
             </w:r>
           </w:p>
         </w:tc>
@@ -6965,25 +6965,25 @@
                 <w:sz w:val="14"/>
                 <w:szCs w:val="14"/>
               </w:rPr>
-              <w:t>{{ id_pers_dur</w:t>
-            </w:r>
-            <w:r>
-              <w:rPr>
-                <w:rFonts w:ascii="Times New Roman" w:hAnsi="Times New Roman"/>
-                <w:color w:val="000000" w:themeColor="text1"/>
-                <w:sz w:val="14"/>
-                <w:szCs w:val="14"/>
-              </w:rPr>
-              <w:t>_pro</w:t>
-            </w:r>
-            <w:r>
-              <w:rPr>
-                <w:rFonts w:ascii="Times New Roman" w:hAnsi="Times New Roman"/>
-                <w:color w:val="000000" w:themeColor="text1"/>
-                <w:sz w:val="14"/>
-                <w:szCs w:val="14"/>
-              </w:rPr>
-              <w:t xml:space="preserve"> }}</w:t>
+              <w:t w:space="preserve" xml:space="preserve">{{ alq_id_pers_dur_pro }}</w:t>
+            </w:r>
+            <w:r>
+              <w:rPr>
+                <w:rFonts w:ascii="Times New Roman" w:hAnsi="Times New Roman"/>
+                <w:color w:val="000000" w:themeColor="text1"/>
+                <w:sz w:val="14"/>
+                <w:szCs w:val="14"/>
+              </w:rPr>
+              <w:t/>
+            </w:r>
+            <w:r>
+              <w:rPr>
+                <w:rFonts w:ascii="Times New Roman" w:hAnsi="Times New Roman"/>
+                <w:color w:val="000000" w:themeColor="text1"/>
+                <w:sz w:val="14"/>
+                <w:szCs w:val="14"/>
+              </w:rPr>
+              <w:t xml:space="preserve"/>
             </w:r>
           </w:p>
         </w:tc>
@@ -7126,16 +7126,16 @@
                 <w:sz w:val="14"/>
                 <w:szCs w:val="14"/>
               </w:rPr>
-              <w:t xml:space="preserve"> </w:t>
-            </w:r>
-            <w:r>
-              <w:rPr>
-                <w:rFonts w:ascii="Times New Roman" w:hAnsi="Times New Roman"/>
-                <w:color w:val="000000" w:themeColor="text1"/>
-                <w:sz w:val="14"/>
-                <w:szCs w:val="14"/>
-              </w:rPr>
-              <w:t>{{ after_test }}</w:t>
+              <w:t xml:space="preserve" w:space="preserve"> {{ alq_after_test }}</w:t>
+            </w:r>
+            <w:r>
+              <w:rPr>
+                <w:rFonts w:ascii="Times New Roman" w:hAnsi="Times New Roman"/>
+                <w:color w:val="000000" w:themeColor="text1"/>
+                <w:sz w:val="14"/>
+                <w:szCs w:val="14"/>
+              </w:rPr>
+              <w:t/>
             </w:r>
           </w:p>
         </w:tc>
@@ -7173,16 +7173,16 @@
                 <w:sz w:val="14"/>
                 <w:szCs w:val="14"/>
               </w:rPr>
-              <w:t>{{ analyst_initial }}</w:t>
-            </w:r>
-            <w:r>
-              <w:rPr>
-                <w:rFonts w:ascii="Times New Roman" w:hAnsi="Times New Roman"/>
-                <w:color w:val="000000" w:themeColor="text1"/>
-                <w:sz w:val="14"/>
-                <w:szCs w:val="14"/>
-              </w:rPr>
-              <w:t xml:space="preserve"> </w:t>
+              <w:t w:space="preserve" xml:space="preserve">{{ alq_analyst_initial }} </w:t>
+            </w:r>
+            <w:r>
+              <w:rPr>
+                <w:rFonts w:ascii="Times New Roman" w:hAnsi="Times New Roman"/>
+                <w:color w:val="000000" w:themeColor="text1"/>
+                <w:sz w:val="14"/>
+                <w:szCs w:val="14"/>
+              </w:rPr>
+              <w:t xml:space="preserve"/>
             </w:r>
           </w:p>
         </w:tc>
@@ -7251,7 +7251,7 @@
                 <w:sz w:val="14"/>
                 <w:szCs w:val="14"/>
               </w:rPr>
-              <w:t>{{ af_obs_pers_dur_pro }}</w:t>
+              <w:t w:space="preserve" xml:space="preserve">{{ alq_af_obs_pers_dur_pro }}</w:t>
             </w:r>
           </w:p>
         </w:tc>
@@ -7279,43 +7279,43 @@
                 <w:sz w:val="14"/>
                 <w:szCs w:val="14"/>
               </w:rPr>
-              <w:t xml:space="preserve">{{ </w:t>
-            </w:r>
-            <w:r>
-              <w:rPr>
-                <w:rFonts w:ascii="Times New Roman" w:hAnsi="Times New Roman"/>
-                <w:color w:val="000000" w:themeColor="text1"/>
-                <w:sz w:val="14"/>
-                <w:szCs w:val="14"/>
-              </w:rPr>
-              <w:t>af_</w:t>
-            </w:r>
-            <w:r>
-              <w:rPr>
-                <w:rFonts w:ascii="Times New Roman" w:hAnsi="Times New Roman"/>
-                <w:color w:val="000000" w:themeColor="text1"/>
-                <w:sz w:val="14"/>
-                <w:szCs w:val="14"/>
-              </w:rPr>
-              <w:t>etx_pers_dur</w:t>
-            </w:r>
-            <w:r>
-              <w:rPr>
-                <w:rFonts w:ascii="Times New Roman" w:hAnsi="Times New Roman"/>
-                <w:color w:val="000000" w:themeColor="text1"/>
-                <w:sz w:val="14"/>
-                <w:szCs w:val="14"/>
-              </w:rPr>
-              <w:t>_pro</w:t>
-            </w:r>
-            <w:r>
-              <w:rPr>
-                <w:rFonts w:ascii="Times New Roman" w:hAnsi="Times New Roman"/>
-                <w:color w:val="000000" w:themeColor="text1"/>
-                <w:sz w:val="14"/>
-                <w:szCs w:val="14"/>
-              </w:rPr>
-              <w:t xml:space="preserve"> }}</w:t>
+              <w:t xml:space="preserve" w:space="preserve">{{ alq_af_etx_pers_dur_pro }}</w:t>
+            </w:r>
+            <w:r>
+              <w:rPr>
+                <w:rFonts w:ascii="Times New Roman" w:hAnsi="Times New Roman"/>
+                <w:color w:val="000000" w:themeColor="text1"/>
+                <w:sz w:val="14"/>
+                <w:szCs w:val="14"/>
+              </w:rPr>
+              <w:t/>
+            </w:r>
+            <w:r>
+              <w:rPr>
+                <w:rFonts w:ascii="Times New Roman" w:hAnsi="Times New Roman"/>
+                <w:color w:val="000000" w:themeColor="text1"/>
+                <w:sz w:val="14"/>
+                <w:szCs w:val="14"/>
+              </w:rPr>
+              <w:t/>
+            </w:r>
+            <w:r>
+              <w:rPr>
+                <w:rFonts w:ascii="Times New Roman" w:hAnsi="Times New Roman"/>
+                <w:color w:val="000000" w:themeColor="text1"/>
+                <w:sz w:val="14"/>
+                <w:szCs w:val="14"/>
+              </w:rPr>
+              <w:t/>
+            </w:r>
+            <w:r>
+              <w:rPr>
+                <w:rFonts w:ascii="Times New Roman" w:hAnsi="Times New Roman"/>
+                <w:color w:val="000000" w:themeColor="text1"/>
+                <w:sz w:val="14"/>
+                <w:szCs w:val="14"/>
+              </w:rPr>
+              <w:t xml:space="preserve"/>
             </w:r>
           </w:p>
         </w:tc>
@@ -7343,43 +7343,43 @@
                 <w:sz w:val="14"/>
                 <w:szCs w:val="14"/>
               </w:rPr>
-              <w:t xml:space="preserve">{{ </w:t>
-            </w:r>
-            <w:r>
-              <w:rPr>
-                <w:rFonts w:ascii="Times New Roman" w:hAnsi="Times New Roman"/>
-                <w:color w:val="000000" w:themeColor="text1"/>
-                <w:sz w:val="14"/>
-                <w:szCs w:val="14"/>
-              </w:rPr>
-              <w:t>af_</w:t>
-            </w:r>
-            <w:r>
-              <w:rPr>
-                <w:rFonts w:ascii="Times New Roman" w:hAnsi="Times New Roman"/>
-                <w:color w:val="000000" w:themeColor="text1"/>
-                <w:sz w:val="14"/>
-                <w:szCs w:val="14"/>
-              </w:rPr>
-              <w:t>id_pers_dur</w:t>
-            </w:r>
-            <w:r>
-              <w:rPr>
-                <w:rFonts w:ascii="Times New Roman" w:hAnsi="Times New Roman"/>
-                <w:color w:val="000000" w:themeColor="text1"/>
-                <w:sz w:val="14"/>
-                <w:szCs w:val="14"/>
-              </w:rPr>
-              <w:t>_pro</w:t>
-            </w:r>
-            <w:r>
-              <w:rPr>
-                <w:rFonts w:ascii="Times New Roman" w:hAnsi="Times New Roman"/>
-                <w:color w:val="000000" w:themeColor="text1"/>
-                <w:sz w:val="14"/>
-                <w:szCs w:val="14"/>
-              </w:rPr>
-              <w:t xml:space="preserve"> }}</w:t>
+              <w:t xml:space="preserve" w:space="preserve">{{ alq_af_id_pers_dur_pro }}</w:t>
+            </w:r>
+            <w:r>
+              <w:rPr>
+                <w:rFonts w:ascii="Times New Roman" w:hAnsi="Times New Roman"/>
+                <w:color w:val="000000" w:themeColor="text1"/>
+                <w:sz w:val="14"/>
+                <w:szCs w:val="14"/>
+              </w:rPr>
+              <w:t/>
+            </w:r>
+            <w:r>
+              <w:rPr>
+                <w:rFonts w:ascii="Times New Roman" w:hAnsi="Times New Roman"/>
+                <w:color w:val="000000" w:themeColor="text1"/>
+                <w:sz w:val="14"/>
+                <w:szCs w:val="14"/>
+              </w:rPr>
+              <w:t/>
+            </w:r>
+            <w:r>
+              <w:rPr>
+                <w:rFonts w:ascii="Times New Roman" w:hAnsi="Times New Roman"/>
+                <w:color w:val="000000" w:themeColor="text1"/>
+                <w:sz w:val="14"/>
+                <w:szCs w:val="14"/>
+              </w:rPr>
+              <w:t/>
+            </w:r>
+            <w:r>
+              <w:rPr>
+                <w:rFonts w:ascii="Times New Roman" w:hAnsi="Times New Roman"/>
+                <w:color w:val="000000" w:themeColor="text1"/>
+                <w:sz w:val="14"/>
+                <w:szCs w:val="14"/>
+              </w:rPr>
+              <w:t xml:space="preserve"/>
             </w:r>
           </w:p>
         </w:tc>
@@ -7558,16 +7558,16 @@
                 <w:sz w:val="14"/>
                 <w:szCs w:val="14"/>
               </w:rPr>
-              <w:t xml:space="preserve"> </w:t>
-            </w:r>
-            <w:r>
-              <w:rPr>
-                <w:rFonts w:ascii="Times New Roman" w:hAnsi="Times New Roman"/>
-                <w:color w:val="000000" w:themeColor="text1"/>
-                <w:sz w:val="14"/>
-                <w:szCs w:val="14"/>
-              </w:rPr>
-              <w:t>{{ before_test }}</w:t>
+              <w:t xml:space="preserve" w:space="preserve"> {{ alq_before_test }}</w:t>
+            </w:r>
+            <w:r>
+              <w:rPr>
+                <w:rFonts w:ascii="Times New Roman" w:hAnsi="Times New Roman"/>
+                <w:color w:val="000000" w:themeColor="text1"/>
+                <w:sz w:val="14"/>
+                <w:szCs w:val="14"/>
+              </w:rPr>
+              <w:t/>
             </w:r>
           </w:p>
         </w:tc>
@@ -7605,7 +7605,7 @@
                 <w:sz w:val="14"/>
                 <w:szCs w:val="14"/>
               </w:rPr>
-              <w:t>{{ analyst_initial }}</w:t>
+              <w:t w:space="preserve" xml:space="preserve">{{ alq_analyst_initial }}</w:t>
             </w:r>
           </w:p>
         </w:tc>
@@ -7674,43 +7674,43 @@
                 <w:sz w:val="14"/>
                 <w:szCs w:val="14"/>
               </w:rPr>
-              <w:t xml:space="preserve">{{ </w:t>
-            </w:r>
-            <w:r>
-              <w:rPr>
-                <w:rFonts w:ascii="Times New Roman" w:hAnsi="Times New Roman"/>
-                <w:color w:val="000000" w:themeColor="text1"/>
-                <w:sz w:val="14"/>
-                <w:szCs w:val="14"/>
-              </w:rPr>
-              <w:t>be_</w:t>
-            </w:r>
-            <w:r>
-              <w:rPr>
-                <w:rFonts w:ascii="Times New Roman" w:hAnsi="Times New Roman"/>
-                <w:color w:val="000000" w:themeColor="text1"/>
-                <w:sz w:val="14"/>
-                <w:szCs w:val="14"/>
-              </w:rPr>
-              <w:t>obs_surf_dur</w:t>
-            </w:r>
-            <w:r>
-              <w:rPr>
-                <w:rFonts w:ascii="Times New Roman" w:hAnsi="Times New Roman"/>
-                <w:color w:val="000000" w:themeColor="text1"/>
-                <w:sz w:val="14"/>
-                <w:szCs w:val="14"/>
-              </w:rPr>
-              <w:t>_pro</w:t>
-            </w:r>
-            <w:r>
-              <w:rPr>
-                <w:rFonts w:ascii="Times New Roman" w:hAnsi="Times New Roman"/>
-                <w:color w:val="000000" w:themeColor="text1"/>
-                <w:sz w:val="14"/>
-                <w:szCs w:val="14"/>
-              </w:rPr>
-              <w:t xml:space="preserve"> }}</w:t>
+              <w:t xml:space="preserve" w:space="preserve">{{ alq_be_obs_surf_dur_pro }}</w:t>
+            </w:r>
+            <w:r>
+              <w:rPr>
+                <w:rFonts w:ascii="Times New Roman" w:hAnsi="Times New Roman"/>
+                <w:color w:val="000000" w:themeColor="text1"/>
+                <w:sz w:val="14"/>
+                <w:szCs w:val="14"/>
+              </w:rPr>
+              <w:t/>
+            </w:r>
+            <w:r>
+              <w:rPr>
+                <w:rFonts w:ascii="Times New Roman" w:hAnsi="Times New Roman"/>
+                <w:color w:val="000000" w:themeColor="text1"/>
+                <w:sz w:val="14"/>
+                <w:szCs w:val="14"/>
+              </w:rPr>
+              <w:t/>
+            </w:r>
+            <w:r>
+              <w:rPr>
+                <w:rFonts w:ascii="Times New Roman" w:hAnsi="Times New Roman"/>
+                <w:color w:val="000000" w:themeColor="text1"/>
+                <w:sz w:val="14"/>
+                <w:szCs w:val="14"/>
+              </w:rPr>
+              <w:t/>
+            </w:r>
+            <w:r>
+              <w:rPr>
+                <w:rFonts w:ascii="Times New Roman" w:hAnsi="Times New Roman"/>
+                <w:color w:val="000000" w:themeColor="text1"/>
+                <w:sz w:val="14"/>
+                <w:szCs w:val="14"/>
+              </w:rPr>
+              <w:t xml:space="preserve"/>
             </w:r>
           </w:p>
         </w:tc>
@@ -7738,43 +7738,43 @@
                 <w:sz w:val="14"/>
                 <w:szCs w:val="14"/>
               </w:rPr>
-              <w:t xml:space="preserve">{{ </w:t>
-            </w:r>
-            <w:r>
-              <w:rPr>
-                <w:rFonts w:ascii="Times New Roman" w:hAnsi="Times New Roman"/>
-                <w:color w:val="000000" w:themeColor="text1"/>
-                <w:sz w:val="14"/>
-                <w:szCs w:val="14"/>
-              </w:rPr>
-              <w:t>be_</w:t>
-            </w:r>
-            <w:r>
-              <w:rPr>
-                <w:rFonts w:ascii="Times New Roman" w:hAnsi="Times New Roman"/>
-                <w:color w:val="000000" w:themeColor="text1"/>
-                <w:sz w:val="14"/>
-                <w:szCs w:val="14"/>
-              </w:rPr>
-              <w:t>etx_surf_dur</w:t>
-            </w:r>
-            <w:r>
-              <w:rPr>
-                <w:rFonts w:ascii="Times New Roman" w:hAnsi="Times New Roman"/>
-                <w:color w:val="000000" w:themeColor="text1"/>
-                <w:sz w:val="14"/>
-                <w:szCs w:val="14"/>
-              </w:rPr>
-              <w:t>_pro</w:t>
-            </w:r>
-            <w:r>
-              <w:rPr>
-                <w:rFonts w:ascii="Times New Roman" w:hAnsi="Times New Roman"/>
-                <w:color w:val="000000" w:themeColor="text1"/>
-                <w:sz w:val="14"/>
-                <w:szCs w:val="14"/>
-              </w:rPr>
-              <w:t xml:space="preserve"> }}</w:t>
+              <w:t xml:space="preserve" w:space="preserve">{{ alq_be_etx_surf_dur_pro }}</w:t>
+            </w:r>
+            <w:r>
+              <w:rPr>
+                <w:rFonts w:ascii="Times New Roman" w:hAnsi="Times New Roman"/>
+                <w:color w:val="000000" w:themeColor="text1"/>
+                <w:sz w:val="14"/>
+                <w:szCs w:val="14"/>
+              </w:rPr>
+              <w:t/>
+            </w:r>
+            <w:r>
+              <w:rPr>
+                <w:rFonts w:ascii="Times New Roman" w:hAnsi="Times New Roman"/>
+                <w:color w:val="000000" w:themeColor="text1"/>
+                <w:sz w:val="14"/>
+                <w:szCs w:val="14"/>
+              </w:rPr>
+              <w:t/>
+            </w:r>
+            <w:r>
+              <w:rPr>
+                <w:rFonts w:ascii="Times New Roman" w:hAnsi="Times New Roman"/>
+                <w:color w:val="000000" w:themeColor="text1"/>
+                <w:sz w:val="14"/>
+                <w:szCs w:val="14"/>
+              </w:rPr>
+              <w:t/>
+            </w:r>
+            <w:r>
+              <w:rPr>
+                <w:rFonts w:ascii="Times New Roman" w:hAnsi="Times New Roman"/>
+                <w:color w:val="000000" w:themeColor="text1"/>
+                <w:sz w:val="14"/>
+                <w:szCs w:val="14"/>
+              </w:rPr>
+              <w:t xml:space="preserve"/>
             </w:r>
           </w:p>
         </w:tc>
@@ -7802,43 +7802,43 @@
                 <w:sz w:val="14"/>
                 <w:szCs w:val="14"/>
               </w:rPr>
-              <w:t xml:space="preserve">{{ </w:t>
-            </w:r>
-            <w:r>
-              <w:rPr>
-                <w:rFonts w:ascii="Times New Roman" w:hAnsi="Times New Roman"/>
-                <w:color w:val="000000" w:themeColor="text1"/>
-                <w:sz w:val="14"/>
-                <w:szCs w:val="14"/>
-              </w:rPr>
-              <w:t>be_</w:t>
-            </w:r>
-            <w:r>
-              <w:rPr>
-                <w:rFonts w:ascii="Times New Roman" w:hAnsi="Times New Roman"/>
-                <w:color w:val="000000" w:themeColor="text1"/>
-                <w:sz w:val="14"/>
-                <w:szCs w:val="14"/>
-              </w:rPr>
-              <w:t>id_surf_dur</w:t>
-            </w:r>
-            <w:r>
-              <w:rPr>
-                <w:rFonts w:ascii="Times New Roman" w:hAnsi="Times New Roman"/>
-                <w:color w:val="000000" w:themeColor="text1"/>
-                <w:sz w:val="14"/>
-                <w:szCs w:val="14"/>
-              </w:rPr>
-              <w:t>_pro</w:t>
-            </w:r>
-            <w:r>
-              <w:rPr>
-                <w:rFonts w:ascii="Times New Roman" w:hAnsi="Times New Roman"/>
-                <w:color w:val="000000" w:themeColor="text1"/>
-                <w:sz w:val="14"/>
-                <w:szCs w:val="14"/>
-              </w:rPr>
-              <w:t xml:space="preserve"> }}</w:t>
+              <w:t xml:space="preserve" w:space="preserve">{{ alq_be_id_surf_dur_pro }}</w:t>
+            </w:r>
+            <w:r>
+              <w:rPr>
+                <w:rFonts w:ascii="Times New Roman" w:hAnsi="Times New Roman"/>
+                <w:color w:val="000000" w:themeColor="text1"/>
+                <w:sz w:val="14"/>
+                <w:szCs w:val="14"/>
+              </w:rPr>
+              <w:t/>
+            </w:r>
+            <w:r>
+              <w:rPr>
+                <w:rFonts w:ascii="Times New Roman" w:hAnsi="Times New Roman"/>
+                <w:color w:val="000000" w:themeColor="text1"/>
+                <w:sz w:val="14"/>
+                <w:szCs w:val="14"/>
+              </w:rPr>
+              <w:t/>
+            </w:r>
+            <w:r>
+              <w:rPr>
+                <w:rFonts w:ascii="Times New Roman" w:hAnsi="Times New Roman"/>
+                <w:color w:val="000000" w:themeColor="text1"/>
+                <w:sz w:val="14"/>
+                <w:szCs w:val="14"/>
+              </w:rPr>
+              <w:t/>
+            </w:r>
+            <w:r>
+              <w:rPr>
+                <w:rFonts w:ascii="Times New Roman" w:hAnsi="Times New Roman"/>
+                <w:color w:val="000000" w:themeColor="text1"/>
+                <w:sz w:val="14"/>
+                <w:szCs w:val="14"/>
+              </w:rPr>
+              <w:t xml:space="preserve"/>
             </w:r>
           </w:p>
         </w:tc>
@@ -7995,16 +7995,16 @@
                 <w:sz w:val="14"/>
                 <w:szCs w:val="14"/>
               </w:rPr>
-              <w:t xml:space="preserve"> </w:t>
-            </w:r>
-            <w:r>
-              <w:rPr>
-                <w:rFonts w:ascii="Times New Roman" w:hAnsi="Times New Roman"/>
-                <w:color w:val="000000" w:themeColor="text1"/>
-                <w:sz w:val="14"/>
-                <w:szCs w:val="14"/>
-              </w:rPr>
-              <w:t>{{ test_date }}</w:t>
+              <w:t xml:space="preserve" w:space="preserve"> {{ alq_test_date }}</w:t>
+            </w:r>
+            <w:r>
+              <w:rPr>
+                <w:rFonts w:ascii="Times New Roman" w:hAnsi="Times New Roman"/>
+                <w:color w:val="000000" w:themeColor="text1"/>
+                <w:sz w:val="14"/>
+                <w:szCs w:val="14"/>
+              </w:rPr>
+              <w:t/>
             </w:r>
           </w:p>
         </w:tc>
@@ -8042,16 +8042,16 @@
                 <w:sz w:val="14"/>
                 <w:szCs w:val="14"/>
               </w:rPr>
-              <w:t>{{ analyst_initial }}</w:t>
-            </w:r>
-            <w:r>
-              <w:rPr>
-                <w:rFonts w:ascii="Times New Roman" w:hAnsi="Times New Roman"/>
-                <w:color w:val="000000" w:themeColor="text1"/>
-                <w:sz w:val="14"/>
-                <w:szCs w:val="14"/>
-              </w:rPr>
-              <w:t xml:space="preserve"> </w:t>
+              <w:t w:space="preserve" xml:space="preserve">{{ alq_analyst_initial }} </w:t>
+            </w:r>
+            <w:r>
+              <w:rPr>
+                <w:rFonts w:ascii="Times New Roman" w:hAnsi="Times New Roman"/>
+                <w:color w:val="000000" w:themeColor="text1"/>
+                <w:sz w:val="14"/>
+                <w:szCs w:val="14"/>
+              </w:rPr>
+              <w:t xml:space="preserve"/>
             </w:r>
           </w:p>
         </w:tc>
@@ -8120,25 +8120,25 @@
                 <w:sz w:val="14"/>
                 <w:szCs w:val="14"/>
               </w:rPr>
-              <w:t>{{ obs_surf_dur</w:t>
-            </w:r>
-            <w:r>
-              <w:rPr>
-                <w:rFonts w:ascii="Times New Roman" w:hAnsi="Times New Roman"/>
-                <w:color w:val="000000" w:themeColor="text1"/>
-                <w:sz w:val="14"/>
-                <w:szCs w:val="14"/>
-              </w:rPr>
-              <w:t>_pro</w:t>
-            </w:r>
-            <w:r>
-              <w:rPr>
-                <w:rFonts w:ascii="Times New Roman" w:hAnsi="Times New Roman"/>
-                <w:color w:val="000000" w:themeColor="text1"/>
-                <w:sz w:val="14"/>
-                <w:szCs w:val="14"/>
-              </w:rPr>
-              <w:t xml:space="preserve"> }}</w:t>
+              <w:t w:space="preserve" xml:space="preserve">{{ alq_obs_surf_dur_pro }}</w:t>
+            </w:r>
+            <w:r>
+              <w:rPr>
+                <w:rFonts w:ascii="Times New Roman" w:hAnsi="Times New Roman"/>
+                <w:color w:val="000000" w:themeColor="text1"/>
+                <w:sz w:val="14"/>
+                <w:szCs w:val="14"/>
+              </w:rPr>
+              <w:t/>
+            </w:r>
+            <w:r>
+              <w:rPr>
+                <w:rFonts w:ascii="Times New Roman" w:hAnsi="Times New Roman"/>
+                <w:color w:val="000000" w:themeColor="text1"/>
+                <w:sz w:val="14"/>
+                <w:szCs w:val="14"/>
+              </w:rPr>
+              <w:t xml:space="preserve"/>
             </w:r>
           </w:p>
         </w:tc>
@@ -8174,25 +8174,25 @@
                 <w:sz w:val="14"/>
                 <w:szCs w:val="14"/>
               </w:rPr>
-              <w:t>{{ etx_surf_dur</w:t>
-            </w:r>
-            <w:r>
-              <w:rPr>
-                <w:rFonts w:ascii="Times New Roman" w:hAnsi="Times New Roman"/>
-                <w:color w:val="000000" w:themeColor="text1"/>
-                <w:sz w:val="14"/>
-                <w:szCs w:val="14"/>
-              </w:rPr>
-              <w:t>_pro</w:t>
-            </w:r>
-            <w:r>
-              <w:rPr>
-                <w:rFonts w:ascii="Times New Roman" w:hAnsi="Times New Roman"/>
-                <w:color w:val="000000" w:themeColor="text1"/>
-                <w:sz w:val="14"/>
-                <w:szCs w:val="14"/>
-              </w:rPr>
-              <w:t xml:space="preserve"> }}</w:t>
+              <w:t w:space="preserve" xml:space="preserve">{{ alq_etx_surf_dur_pro }}</w:t>
+            </w:r>
+            <w:r>
+              <w:rPr>
+                <w:rFonts w:ascii="Times New Roman" w:hAnsi="Times New Roman"/>
+                <w:color w:val="000000" w:themeColor="text1"/>
+                <w:sz w:val="14"/>
+                <w:szCs w:val="14"/>
+              </w:rPr>
+              <w:t/>
+            </w:r>
+            <w:r>
+              <w:rPr>
+                <w:rFonts w:ascii="Times New Roman" w:hAnsi="Times New Roman"/>
+                <w:color w:val="000000" w:themeColor="text1"/>
+                <w:sz w:val="14"/>
+                <w:szCs w:val="14"/>
+              </w:rPr>
+              <w:t xml:space="preserve"/>
             </w:r>
           </w:p>
         </w:tc>
@@ -8228,25 +8228,25 @@
                 <w:sz w:val="14"/>
                 <w:szCs w:val="14"/>
               </w:rPr>
-              <w:t>{{ id_surf_dur</w:t>
-            </w:r>
-            <w:r>
-              <w:rPr>
-                <w:rFonts w:ascii="Times New Roman" w:hAnsi="Times New Roman"/>
-                <w:color w:val="000000" w:themeColor="text1"/>
-                <w:sz w:val="14"/>
-                <w:szCs w:val="14"/>
-              </w:rPr>
-              <w:t>_pro</w:t>
-            </w:r>
-            <w:r>
-              <w:rPr>
-                <w:rFonts w:ascii="Times New Roman" w:hAnsi="Times New Roman"/>
-                <w:color w:val="000000" w:themeColor="text1"/>
-                <w:sz w:val="14"/>
-                <w:szCs w:val="14"/>
-              </w:rPr>
-              <w:t xml:space="preserve"> }}</w:t>
+              <w:t w:space="preserve" xml:space="preserve">{{ alq_id_surf_dur_pro }}</w:t>
+            </w:r>
+            <w:r>
+              <w:rPr>
+                <w:rFonts w:ascii="Times New Roman" w:hAnsi="Times New Roman"/>
+                <w:color w:val="000000" w:themeColor="text1"/>
+                <w:sz w:val="14"/>
+                <w:szCs w:val="14"/>
+              </w:rPr>
+              <w:t/>
+            </w:r>
+            <w:r>
+              <w:rPr>
+                <w:rFonts w:ascii="Times New Roman" w:hAnsi="Times New Roman"/>
+                <w:color w:val="000000" w:themeColor="text1"/>
+                <w:sz w:val="14"/>
+                <w:szCs w:val="14"/>
+              </w:rPr>
+              <w:t xml:space="preserve"/>
             </w:r>
           </w:p>
         </w:tc>
@@ -8389,16 +8389,16 @@
                 <w:sz w:val="14"/>
                 <w:szCs w:val="14"/>
               </w:rPr>
-              <w:t xml:space="preserve"> </w:t>
-            </w:r>
-            <w:r>
-              <w:rPr>
-                <w:rFonts w:ascii="Times New Roman" w:hAnsi="Times New Roman"/>
-                <w:color w:val="000000" w:themeColor="text1"/>
-                <w:sz w:val="14"/>
-                <w:szCs w:val="14"/>
-              </w:rPr>
-              <w:t>{{ after_test }}</w:t>
+              <w:t xml:space="preserve" w:space="preserve"> {{ alq_after_test }}</w:t>
+            </w:r>
+            <w:r>
+              <w:rPr>
+                <w:rFonts w:ascii="Times New Roman" w:hAnsi="Times New Roman"/>
+                <w:color w:val="000000" w:themeColor="text1"/>
+                <w:sz w:val="14"/>
+                <w:szCs w:val="14"/>
+              </w:rPr>
+              <w:t/>
             </w:r>
           </w:p>
         </w:tc>
@@ -8436,16 +8436,16 @@
                 <w:sz w:val="14"/>
                 <w:szCs w:val="14"/>
               </w:rPr>
-              <w:t>{{ analyst_initial }}</w:t>
-            </w:r>
-            <w:r>
-              <w:rPr>
-                <w:rFonts w:ascii="Times New Roman" w:hAnsi="Times New Roman"/>
-                <w:color w:val="000000" w:themeColor="text1"/>
-                <w:sz w:val="14"/>
-                <w:szCs w:val="14"/>
-              </w:rPr>
-              <w:t xml:space="preserve"> </w:t>
+              <w:t w:space="preserve" xml:space="preserve">{{ alq_analyst_initial }} </w:t>
+            </w:r>
+            <w:r>
+              <w:rPr>
+                <w:rFonts w:ascii="Times New Roman" w:hAnsi="Times New Roman"/>
+                <w:color w:val="000000" w:themeColor="text1"/>
+                <w:sz w:val="14"/>
+                <w:szCs w:val="14"/>
+              </w:rPr>
+              <w:t xml:space="preserve"/>
             </w:r>
           </w:p>
         </w:tc>
@@ -8514,43 +8514,43 @@
                 <w:sz w:val="14"/>
                 <w:szCs w:val="14"/>
               </w:rPr>
-              <w:t xml:space="preserve">{{ </w:t>
-            </w:r>
-            <w:r>
-              <w:rPr>
-                <w:rFonts w:ascii="Times New Roman" w:hAnsi="Times New Roman"/>
-                <w:color w:val="000000" w:themeColor="text1"/>
-                <w:sz w:val="14"/>
-                <w:szCs w:val="14"/>
-              </w:rPr>
-              <w:t>af_</w:t>
-            </w:r>
-            <w:r>
-              <w:rPr>
-                <w:rFonts w:ascii="Times New Roman" w:hAnsi="Times New Roman"/>
-                <w:color w:val="000000" w:themeColor="text1"/>
-                <w:sz w:val="14"/>
-                <w:szCs w:val="14"/>
-              </w:rPr>
-              <w:t>obs_surf_dur</w:t>
-            </w:r>
-            <w:r>
-              <w:rPr>
-                <w:rFonts w:ascii="Times New Roman" w:hAnsi="Times New Roman"/>
-                <w:color w:val="000000" w:themeColor="text1"/>
-                <w:sz w:val="14"/>
-                <w:szCs w:val="14"/>
-              </w:rPr>
-              <w:t>_pro</w:t>
-            </w:r>
-            <w:r>
-              <w:rPr>
-                <w:rFonts w:ascii="Times New Roman" w:hAnsi="Times New Roman"/>
-                <w:color w:val="000000" w:themeColor="text1"/>
-                <w:sz w:val="14"/>
-                <w:szCs w:val="14"/>
-              </w:rPr>
-              <w:t xml:space="preserve"> }}</w:t>
+              <w:t xml:space="preserve" w:space="preserve">{{ alq_af_obs_surf_dur_pro }}</w:t>
+            </w:r>
+            <w:r>
+              <w:rPr>
+                <w:rFonts w:ascii="Times New Roman" w:hAnsi="Times New Roman"/>
+                <w:color w:val="000000" w:themeColor="text1"/>
+                <w:sz w:val="14"/>
+                <w:szCs w:val="14"/>
+              </w:rPr>
+              <w:t/>
+            </w:r>
+            <w:r>
+              <w:rPr>
+                <w:rFonts w:ascii="Times New Roman" w:hAnsi="Times New Roman"/>
+                <w:color w:val="000000" w:themeColor="text1"/>
+                <w:sz w:val="14"/>
+                <w:szCs w:val="14"/>
+              </w:rPr>
+              <w:t/>
+            </w:r>
+            <w:r>
+              <w:rPr>
+                <w:rFonts w:ascii="Times New Roman" w:hAnsi="Times New Roman"/>
+                <w:color w:val="000000" w:themeColor="text1"/>
+                <w:sz w:val="14"/>
+                <w:szCs w:val="14"/>
+              </w:rPr>
+              <w:t/>
+            </w:r>
+            <w:r>
+              <w:rPr>
+                <w:rFonts w:ascii="Times New Roman" w:hAnsi="Times New Roman"/>
+                <w:color w:val="000000" w:themeColor="text1"/>
+                <w:sz w:val="14"/>
+                <w:szCs w:val="14"/>
+              </w:rPr>
+              <w:t xml:space="preserve"/>
             </w:r>
           </w:p>
         </w:tc>
@@ -8578,43 +8578,43 @@
                 <w:sz w:val="14"/>
                 <w:szCs w:val="14"/>
               </w:rPr>
-              <w:t xml:space="preserve">{{ </w:t>
-            </w:r>
-            <w:r>
-              <w:rPr>
-                <w:rFonts w:ascii="Times New Roman" w:hAnsi="Times New Roman"/>
-                <w:color w:val="000000" w:themeColor="text1"/>
-                <w:sz w:val="14"/>
-                <w:szCs w:val="14"/>
-              </w:rPr>
-              <w:t>af_</w:t>
-            </w:r>
-            <w:r>
-              <w:rPr>
-                <w:rFonts w:ascii="Times New Roman" w:hAnsi="Times New Roman"/>
-                <w:color w:val="000000" w:themeColor="text1"/>
-                <w:sz w:val="14"/>
-                <w:szCs w:val="14"/>
-              </w:rPr>
-              <w:t>etx_surf_dur</w:t>
-            </w:r>
-            <w:r>
-              <w:rPr>
-                <w:rFonts w:ascii="Times New Roman" w:hAnsi="Times New Roman"/>
-                <w:color w:val="000000" w:themeColor="text1"/>
-                <w:sz w:val="14"/>
-                <w:szCs w:val="14"/>
-              </w:rPr>
-              <w:t>_pro</w:t>
-            </w:r>
-            <w:r>
-              <w:rPr>
-                <w:rFonts w:ascii="Times New Roman" w:hAnsi="Times New Roman"/>
-                <w:color w:val="000000" w:themeColor="text1"/>
-                <w:sz w:val="14"/>
-                <w:szCs w:val="14"/>
-              </w:rPr>
-              <w:t xml:space="preserve"> }}</w:t>
+              <w:t xml:space="preserve" w:space="preserve">{{ alq_af_etx_surf_dur_pro }}</w:t>
+            </w:r>
+            <w:r>
+              <w:rPr>
+                <w:rFonts w:ascii="Times New Roman" w:hAnsi="Times New Roman"/>
+                <w:color w:val="000000" w:themeColor="text1"/>
+                <w:sz w:val="14"/>
+                <w:szCs w:val="14"/>
+              </w:rPr>
+              <w:t/>
+            </w:r>
+            <w:r>
+              <w:rPr>
+                <w:rFonts w:ascii="Times New Roman" w:hAnsi="Times New Roman"/>
+                <w:color w:val="000000" w:themeColor="text1"/>
+                <w:sz w:val="14"/>
+                <w:szCs w:val="14"/>
+              </w:rPr>
+              <w:t/>
+            </w:r>
+            <w:r>
+              <w:rPr>
+                <w:rFonts w:ascii="Times New Roman" w:hAnsi="Times New Roman"/>
+                <w:color w:val="000000" w:themeColor="text1"/>
+                <w:sz w:val="14"/>
+                <w:szCs w:val="14"/>
+              </w:rPr>
+              <w:t/>
+            </w:r>
+            <w:r>
+              <w:rPr>
+                <w:rFonts w:ascii="Times New Roman" w:hAnsi="Times New Roman"/>
+                <w:color w:val="000000" w:themeColor="text1"/>
+                <w:sz w:val="14"/>
+                <w:szCs w:val="14"/>
+              </w:rPr>
+              <w:t xml:space="preserve"/>
             </w:r>
           </w:p>
         </w:tc>
@@ -8642,43 +8642,43 @@
                 <w:sz w:val="14"/>
                 <w:szCs w:val="14"/>
               </w:rPr>
-              <w:t xml:space="preserve">{{ </w:t>
-            </w:r>
-            <w:r>
-              <w:rPr>
-                <w:rFonts w:ascii="Times New Roman" w:hAnsi="Times New Roman"/>
-                <w:color w:val="000000" w:themeColor="text1"/>
-                <w:sz w:val="14"/>
-                <w:szCs w:val="14"/>
-              </w:rPr>
-              <w:t>af_</w:t>
-            </w:r>
-            <w:r>
-              <w:rPr>
-                <w:rFonts w:ascii="Times New Roman" w:hAnsi="Times New Roman"/>
-                <w:color w:val="000000" w:themeColor="text1"/>
-                <w:sz w:val="14"/>
-                <w:szCs w:val="14"/>
-              </w:rPr>
-              <w:t>id_surf_dur</w:t>
-            </w:r>
-            <w:r>
-              <w:rPr>
-                <w:rFonts w:ascii="Times New Roman" w:hAnsi="Times New Roman"/>
-                <w:color w:val="000000" w:themeColor="text1"/>
-                <w:sz w:val="14"/>
-                <w:szCs w:val="14"/>
-              </w:rPr>
-              <w:t>_pro</w:t>
-            </w:r>
-            <w:r>
-              <w:rPr>
-                <w:rFonts w:ascii="Times New Roman" w:hAnsi="Times New Roman"/>
-                <w:color w:val="000000" w:themeColor="text1"/>
-                <w:sz w:val="14"/>
-                <w:szCs w:val="14"/>
-              </w:rPr>
-              <w:t xml:space="preserve"> }}</w:t>
+              <w:t xml:space="preserve" w:space="preserve">{{ alq_af_id_surf_dur_pro }}</w:t>
+            </w:r>
+            <w:r>
+              <w:rPr>
+                <w:rFonts w:ascii="Times New Roman" w:hAnsi="Times New Roman"/>
+                <w:color w:val="000000" w:themeColor="text1"/>
+                <w:sz w:val="14"/>
+                <w:szCs w:val="14"/>
+              </w:rPr>
+              <w:t/>
+            </w:r>
+            <w:r>
+              <w:rPr>
+                <w:rFonts w:ascii="Times New Roman" w:hAnsi="Times New Roman"/>
+                <w:color w:val="000000" w:themeColor="text1"/>
+                <w:sz w:val="14"/>
+                <w:szCs w:val="14"/>
+              </w:rPr>
+              <w:t/>
+            </w:r>
+            <w:r>
+              <w:rPr>
+                <w:rFonts w:ascii="Times New Roman" w:hAnsi="Times New Roman"/>
+                <w:color w:val="000000" w:themeColor="text1"/>
+                <w:sz w:val="14"/>
+                <w:szCs w:val="14"/>
+              </w:rPr>
+              <w:t/>
+            </w:r>
+            <w:r>
+              <w:rPr>
+                <w:rFonts w:ascii="Times New Roman" w:hAnsi="Times New Roman"/>
+                <w:color w:val="000000" w:themeColor="text1"/>
+                <w:sz w:val="14"/>
+                <w:szCs w:val="14"/>
+              </w:rPr>
+              <w:t xml:space="preserve"/>
             </w:r>
           </w:p>
         </w:tc>
@@ -8821,7 +8821,7 @@
                 <w:sz w:val="14"/>
                 <w:szCs w:val="14"/>
               </w:rPr>
-              <w:t>{{ before_test }}</w:t>
+              <w:t w:space="preserve" xml:space="preserve">{{ alq_before_test }}</w:t>
             </w:r>
           </w:p>
         </w:tc>
@@ -8859,7 +8859,7 @@
                 <w:sz w:val="14"/>
                 <w:szCs w:val="14"/>
               </w:rPr>
-              <w:t>{{ analyst_initial }}</w:t>
+              <w:t w:space="preserve" xml:space="preserve">{{ alq_analyst_initial }}</w:t>
             </w:r>
           </w:p>
         </w:tc>
@@ -8928,7 +8928,7 @@
                 <w:sz w:val="14"/>
                 <w:szCs w:val="14"/>
               </w:rPr>
-              <w:t xml:space="preserve">{{ </w:t>
+              <w:t xml:space="preserve" w:space="preserve">{{ alq_be_obs_sett_dur_pro }}</w:t>
             </w:r>
             <w:r>
               <w:rPr>
@@ -8938,34 +8938,34 @@
                 <w:szCs w:val="14"/>
                 <w:lang w:eastAsia="zh-CN"/>
               </w:rPr>
-              <w:t>be_</w:t>
-            </w:r>
-            <w:r>
-              <w:rPr>
-                <w:rFonts w:ascii="Times New Roman" w:hAnsi="Times New Roman"/>
-                <w:color w:val="000000" w:themeColor="text1"/>
-                <w:sz w:val="14"/>
-                <w:szCs w:val="14"/>
-              </w:rPr>
-              <w:t>obs_sett_dur</w:t>
-            </w:r>
-            <w:r>
-              <w:rPr>
-                <w:rFonts w:ascii="Times New Roman" w:hAnsi="Times New Roman"/>
-                <w:color w:val="000000" w:themeColor="text1"/>
-                <w:sz w:val="14"/>
-                <w:szCs w:val="14"/>
-              </w:rPr>
-              <w:t>_pro</w:t>
-            </w:r>
-            <w:r>
-              <w:rPr>
-                <w:rFonts w:ascii="Times New Roman" w:hAnsi="Times New Roman"/>
-                <w:color w:val="000000" w:themeColor="text1"/>
-                <w:sz w:val="14"/>
-                <w:szCs w:val="14"/>
-              </w:rPr>
-              <w:t xml:space="preserve"> }}</w:t>
+              <w:t/>
+            </w:r>
+            <w:r>
+              <w:rPr>
+                <w:rFonts w:ascii="Times New Roman" w:hAnsi="Times New Roman"/>
+                <w:color w:val="000000" w:themeColor="text1"/>
+                <w:sz w:val="14"/>
+                <w:szCs w:val="14"/>
+              </w:rPr>
+              <w:t/>
+            </w:r>
+            <w:r>
+              <w:rPr>
+                <w:rFonts w:ascii="Times New Roman" w:hAnsi="Times New Roman"/>
+                <w:color w:val="000000" w:themeColor="text1"/>
+                <w:sz w:val="14"/>
+                <w:szCs w:val="14"/>
+              </w:rPr>
+              <w:t/>
+            </w:r>
+            <w:r>
+              <w:rPr>
+                <w:rFonts w:ascii="Times New Roman" w:hAnsi="Times New Roman"/>
+                <w:color w:val="000000" w:themeColor="text1"/>
+                <w:sz w:val="14"/>
+                <w:szCs w:val="14"/>
+              </w:rPr>
+              <w:t xml:space="preserve"/>
             </w:r>
           </w:p>
         </w:tc>
@@ -8993,7 +8993,7 @@
                 <w:sz w:val="14"/>
                 <w:szCs w:val="14"/>
               </w:rPr>
-              <w:t xml:space="preserve">{{ </w:t>
+              <w:t xml:space="preserve" w:space="preserve">{{ alq_be_etx_sett_dur_pro }}</w:t>
             </w:r>
             <w:r>
               <w:rPr>
@@ -9003,34 +9003,34 @@
                 <w:szCs w:val="14"/>
                 <w:lang w:eastAsia="zh-CN"/>
               </w:rPr>
-              <w:t>be_</w:t>
-            </w:r>
-            <w:r>
-              <w:rPr>
-                <w:rFonts w:ascii="Times New Roman" w:hAnsi="Times New Roman"/>
-                <w:color w:val="000000" w:themeColor="text1"/>
-                <w:sz w:val="14"/>
-                <w:szCs w:val="14"/>
-              </w:rPr>
-              <w:t>etx_sett_dur</w:t>
-            </w:r>
-            <w:r>
-              <w:rPr>
-                <w:rFonts w:ascii="Times New Roman" w:hAnsi="Times New Roman"/>
-                <w:color w:val="000000" w:themeColor="text1"/>
-                <w:sz w:val="14"/>
-                <w:szCs w:val="14"/>
-              </w:rPr>
-              <w:t>_pro</w:t>
-            </w:r>
-            <w:r>
-              <w:rPr>
-                <w:rFonts w:ascii="Times New Roman" w:hAnsi="Times New Roman"/>
-                <w:color w:val="000000" w:themeColor="text1"/>
-                <w:sz w:val="14"/>
-                <w:szCs w:val="14"/>
-              </w:rPr>
-              <w:t xml:space="preserve"> }}</w:t>
+              <w:t/>
+            </w:r>
+            <w:r>
+              <w:rPr>
+                <w:rFonts w:ascii="Times New Roman" w:hAnsi="Times New Roman"/>
+                <w:color w:val="000000" w:themeColor="text1"/>
+                <w:sz w:val="14"/>
+                <w:szCs w:val="14"/>
+              </w:rPr>
+              <w:t/>
+            </w:r>
+            <w:r>
+              <w:rPr>
+                <w:rFonts w:ascii="Times New Roman" w:hAnsi="Times New Roman"/>
+                <w:color w:val="000000" w:themeColor="text1"/>
+                <w:sz w:val="14"/>
+                <w:szCs w:val="14"/>
+              </w:rPr>
+              <w:t/>
+            </w:r>
+            <w:r>
+              <w:rPr>
+                <w:rFonts w:ascii="Times New Roman" w:hAnsi="Times New Roman"/>
+                <w:color w:val="000000" w:themeColor="text1"/>
+                <w:sz w:val="14"/>
+                <w:szCs w:val="14"/>
+              </w:rPr>
+              <w:t xml:space="preserve"/>
             </w:r>
           </w:p>
         </w:tc>
@@ -9058,7 +9058,7 @@
                 <w:sz w:val="14"/>
                 <w:szCs w:val="14"/>
               </w:rPr>
-              <w:t xml:space="preserve">{{ </w:t>
+              <w:t xml:space="preserve" w:space="preserve">{{ alq_be_id_sett_dur_pro }}</w:t>
             </w:r>
             <w:r>
               <w:rPr>
@@ -9068,34 +9068,34 @@
                 <w:szCs w:val="14"/>
                 <w:lang w:eastAsia="zh-CN"/>
               </w:rPr>
-              <w:t>be_</w:t>
-            </w:r>
-            <w:r>
-              <w:rPr>
-                <w:rFonts w:ascii="Times New Roman" w:hAnsi="Times New Roman"/>
-                <w:color w:val="000000" w:themeColor="text1"/>
-                <w:sz w:val="14"/>
-                <w:szCs w:val="14"/>
-              </w:rPr>
-              <w:t>id_sett_dur</w:t>
-            </w:r>
-            <w:r>
-              <w:rPr>
-                <w:rFonts w:ascii="Times New Roman" w:hAnsi="Times New Roman"/>
-                <w:color w:val="000000" w:themeColor="text1"/>
-                <w:sz w:val="14"/>
-                <w:szCs w:val="14"/>
-              </w:rPr>
-              <w:t>_pro</w:t>
-            </w:r>
-            <w:r>
-              <w:rPr>
-                <w:rFonts w:ascii="Times New Roman" w:hAnsi="Times New Roman"/>
-                <w:color w:val="000000" w:themeColor="text1"/>
-                <w:sz w:val="14"/>
-                <w:szCs w:val="14"/>
-              </w:rPr>
-              <w:t xml:space="preserve"> }}</w:t>
+              <w:t/>
+            </w:r>
+            <w:r>
+              <w:rPr>
+                <w:rFonts w:ascii="Times New Roman" w:hAnsi="Times New Roman"/>
+                <w:color w:val="000000" w:themeColor="text1"/>
+                <w:sz w:val="14"/>
+                <w:szCs w:val="14"/>
+              </w:rPr>
+              <w:t/>
+            </w:r>
+            <w:r>
+              <w:rPr>
+                <w:rFonts w:ascii="Times New Roman" w:hAnsi="Times New Roman"/>
+                <w:color w:val="000000" w:themeColor="text1"/>
+                <w:sz w:val="14"/>
+                <w:szCs w:val="14"/>
+              </w:rPr>
+              <w:t/>
+            </w:r>
+            <w:r>
+              <w:rPr>
+                <w:rFonts w:ascii="Times New Roman" w:hAnsi="Times New Roman"/>
+                <w:color w:val="000000" w:themeColor="text1"/>
+                <w:sz w:val="14"/>
+                <w:szCs w:val="14"/>
+              </w:rPr>
+              <w:t xml:space="preserve"/>
             </w:r>
           </w:p>
         </w:tc>
@@ -9238,16 +9238,16 @@
                 <w:sz w:val="14"/>
                 <w:szCs w:val="14"/>
               </w:rPr>
-              <w:t xml:space="preserve"> </w:t>
-            </w:r>
-            <w:r>
-              <w:rPr>
-                <w:rFonts w:ascii="Times New Roman" w:hAnsi="Times New Roman"/>
-                <w:color w:val="000000" w:themeColor="text1"/>
-                <w:sz w:val="14"/>
-                <w:szCs w:val="14"/>
-              </w:rPr>
-              <w:t>{{ test_date }}</w:t>
+              <w:t xml:space="preserve" w:space="preserve"> {{ alq_test_date }}</w:t>
+            </w:r>
+            <w:r>
+              <w:rPr>
+                <w:rFonts w:ascii="Times New Roman" w:hAnsi="Times New Roman"/>
+                <w:color w:val="000000" w:themeColor="text1"/>
+                <w:sz w:val="14"/>
+                <w:szCs w:val="14"/>
+              </w:rPr>
+              <w:t/>
             </w:r>
           </w:p>
         </w:tc>
@@ -9285,16 +9285,16 @@
                 <w:sz w:val="14"/>
                 <w:szCs w:val="14"/>
               </w:rPr>
-              <w:t>{{ analyst_initial }}</w:t>
-            </w:r>
-            <w:r>
-              <w:rPr>
-                <w:rFonts w:ascii="Times New Roman" w:hAnsi="Times New Roman"/>
-                <w:color w:val="000000" w:themeColor="text1"/>
-                <w:sz w:val="14"/>
-                <w:szCs w:val="14"/>
-              </w:rPr>
-              <w:t xml:space="preserve"> </w:t>
+              <w:t w:space="preserve" xml:space="preserve">{{ alq_analyst_initial }} </w:t>
+            </w:r>
+            <w:r>
+              <w:rPr>
+                <w:rFonts w:ascii="Times New Roman" w:hAnsi="Times New Roman"/>
+                <w:color w:val="000000" w:themeColor="text1"/>
+                <w:sz w:val="14"/>
+                <w:szCs w:val="14"/>
+              </w:rPr>
+              <w:t xml:space="preserve"/>
             </w:r>
           </w:p>
         </w:tc>
@@ -9363,25 +9363,25 @@
                 <w:sz w:val="14"/>
                 <w:szCs w:val="14"/>
               </w:rPr>
-              <w:t>{{ obs_sett_dur</w:t>
-            </w:r>
-            <w:r>
-              <w:rPr>
-                <w:rFonts w:ascii="Times New Roman" w:hAnsi="Times New Roman"/>
-                <w:color w:val="000000" w:themeColor="text1"/>
-                <w:sz w:val="14"/>
-                <w:szCs w:val="14"/>
-              </w:rPr>
-              <w:t>_pro</w:t>
-            </w:r>
-            <w:r>
-              <w:rPr>
-                <w:rFonts w:ascii="Times New Roman" w:hAnsi="Times New Roman"/>
-                <w:color w:val="000000" w:themeColor="text1"/>
-                <w:sz w:val="14"/>
-                <w:szCs w:val="14"/>
-              </w:rPr>
-              <w:t xml:space="preserve"> }}</w:t>
+              <w:t w:space="preserve" xml:space="preserve">{{ alq_obs_sett_dur_pro }}</w:t>
+            </w:r>
+            <w:r>
+              <w:rPr>
+                <w:rFonts w:ascii="Times New Roman" w:hAnsi="Times New Roman"/>
+                <w:color w:val="000000" w:themeColor="text1"/>
+                <w:sz w:val="14"/>
+                <w:szCs w:val="14"/>
+              </w:rPr>
+              <w:t/>
+            </w:r>
+            <w:r>
+              <w:rPr>
+                <w:rFonts w:ascii="Times New Roman" w:hAnsi="Times New Roman"/>
+                <w:color w:val="000000" w:themeColor="text1"/>
+                <w:sz w:val="14"/>
+                <w:szCs w:val="14"/>
+              </w:rPr>
+              <w:t xml:space="preserve"/>
             </w:r>
           </w:p>
         </w:tc>
@@ -9417,25 +9417,25 @@
                 <w:sz w:val="14"/>
                 <w:szCs w:val="14"/>
               </w:rPr>
-              <w:t>{{ etx_sett_dur</w:t>
-            </w:r>
-            <w:r>
-              <w:rPr>
-                <w:rFonts w:ascii="Times New Roman" w:hAnsi="Times New Roman"/>
-                <w:color w:val="000000" w:themeColor="text1"/>
-                <w:sz w:val="14"/>
-                <w:szCs w:val="14"/>
-              </w:rPr>
-              <w:t>_pro</w:t>
-            </w:r>
-            <w:r>
-              <w:rPr>
-                <w:rFonts w:ascii="Times New Roman" w:hAnsi="Times New Roman"/>
-                <w:color w:val="000000" w:themeColor="text1"/>
-                <w:sz w:val="14"/>
-                <w:szCs w:val="14"/>
-              </w:rPr>
-              <w:t xml:space="preserve"> }}</w:t>
+              <w:t w:space="preserve" xml:space="preserve">{{ alq_etx_sett_dur_pro }}</w:t>
+            </w:r>
+            <w:r>
+              <w:rPr>
+                <w:rFonts w:ascii="Times New Roman" w:hAnsi="Times New Roman"/>
+                <w:color w:val="000000" w:themeColor="text1"/>
+                <w:sz w:val="14"/>
+                <w:szCs w:val="14"/>
+              </w:rPr>
+              <w:t/>
+            </w:r>
+            <w:r>
+              <w:rPr>
+                <w:rFonts w:ascii="Times New Roman" w:hAnsi="Times New Roman"/>
+                <w:color w:val="000000" w:themeColor="text1"/>
+                <w:sz w:val="14"/>
+                <w:szCs w:val="14"/>
+              </w:rPr>
+              <w:t xml:space="preserve"/>
             </w:r>
           </w:p>
         </w:tc>
@@ -9471,25 +9471,25 @@
                 <w:sz w:val="14"/>
                 <w:szCs w:val="14"/>
               </w:rPr>
-              <w:t>{{ id_sett_dur</w:t>
-            </w:r>
-            <w:r>
-              <w:rPr>
-                <w:rFonts w:ascii="Times New Roman" w:hAnsi="Times New Roman"/>
-                <w:color w:val="000000" w:themeColor="text1"/>
-                <w:sz w:val="14"/>
-                <w:szCs w:val="14"/>
-              </w:rPr>
-              <w:t>_pro</w:t>
-            </w:r>
-            <w:r>
-              <w:rPr>
-                <w:rFonts w:ascii="Times New Roman" w:hAnsi="Times New Roman"/>
-                <w:color w:val="000000" w:themeColor="text1"/>
-                <w:sz w:val="14"/>
-                <w:szCs w:val="14"/>
-              </w:rPr>
-              <w:t xml:space="preserve"> }}</w:t>
+              <w:t w:space="preserve" xml:space="preserve">{{ alq_id_sett_dur_pro }}</w:t>
+            </w:r>
+            <w:r>
+              <w:rPr>
+                <w:rFonts w:ascii="Times New Roman" w:hAnsi="Times New Roman"/>
+                <w:color w:val="000000" w:themeColor="text1"/>
+                <w:sz w:val="14"/>
+                <w:szCs w:val="14"/>
+              </w:rPr>
+              <w:t/>
+            </w:r>
+            <w:r>
+              <w:rPr>
+                <w:rFonts w:ascii="Times New Roman" w:hAnsi="Times New Roman"/>
+                <w:color w:val="000000" w:themeColor="text1"/>
+                <w:sz w:val="14"/>
+                <w:szCs w:val="14"/>
+              </w:rPr>
+              <w:t xml:space="preserve"/>
             </w:r>
           </w:p>
         </w:tc>
@@ -9632,16 +9632,16 @@
                 <w:sz w:val="14"/>
                 <w:szCs w:val="14"/>
               </w:rPr>
-              <w:t xml:space="preserve"> </w:t>
-            </w:r>
-            <w:r>
-              <w:rPr>
-                <w:rFonts w:ascii="Times New Roman" w:hAnsi="Times New Roman"/>
-                <w:color w:val="000000" w:themeColor="text1"/>
-                <w:sz w:val="14"/>
-                <w:szCs w:val="14"/>
-              </w:rPr>
-              <w:t>{{ after_test }}</w:t>
+              <w:t xml:space="preserve" w:space="preserve"> {{ alq_after_test }}</w:t>
+            </w:r>
+            <w:r>
+              <w:rPr>
+                <w:rFonts w:ascii="Times New Roman" w:hAnsi="Times New Roman"/>
+                <w:color w:val="000000" w:themeColor="text1"/>
+                <w:sz w:val="14"/>
+                <w:szCs w:val="14"/>
+              </w:rPr>
+              <w:t/>
             </w:r>
           </w:p>
         </w:tc>
@@ -9679,16 +9679,16 @@
                 <w:sz w:val="14"/>
                 <w:szCs w:val="14"/>
               </w:rPr>
-              <w:t>{{ analyst_initial }}</w:t>
-            </w:r>
-            <w:r>
-              <w:rPr>
-                <w:rFonts w:ascii="Times New Roman" w:hAnsi="Times New Roman"/>
-                <w:color w:val="000000" w:themeColor="text1"/>
-                <w:sz w:val="14"/>
-                <w:szCs w:val="14"/>
-              </w:rPr>
-              <w:t xml:space="preserve"> </w:t>
+              <w:t w:space="preserve" xml:space="preserve">{{ alq_analyst_initial }} </w:t>
+            </w:r>
+            <w:r>
+              <w:rPr>
+                <w:rFonts w:ascii="Times New Roman" w:hAnsi="Times New Roman"/>
+                <w:color w:val="000000" w:themeColor="text1"/>
+                <w:sz w:val="14"/>
+                <w:szCs w:val="14"/>
+              </w:rPr>
+              <w:t xml:space="preserve"/>
             </w:r>
           </w:p>
         </w:tc>
@@ -9757,7 +9757,7 @@
                 <w:sz w:val="14"/>
                 <w:szCs w:val="14"/>
               </w:rPr>
-              <w:t xml:space="preserve">{{ </w:t>
+              <w:t xml:space="preserve" w:space="preserve">{{ alq_af_obs_sett_dur_pro }}</w:t>
             </w:r>
             <w:r>
               <w:rPr>
@@ -9767,34 +9767,34 @@
                 <w:szCs w:val="14"/>
                 <w:lang w:eastAsia="zh-CN"/>
               </w:rPr>
-              <w:t>af_</w:t>
-            </w:r>
-            <w:r>
-              <w:rPr>
-                <w:rFonts w:ascii="Times New Roman" w:hAnsi="Times New Roman"/>
-                <w:color w:val="000000" w:themeColor="text1"/>
-                <w:sz w:val="14"/>
-                <w:szCs w:val="14"/>
-              </w:rPr>
-              <w:t>obs_sett_dur</w:t>
-            </w:r>
-            <w:r>
-              <w:rPr>
-                <w:rFonts w:ascii="Times New Roman" w:hAnsi="Times New Roman"/>
-                <w:color w:val="000000" w:themeColor="text1"/>
-                <w:sz w:val="14"/>
-                <w:szCs w:val="14"/>
-              </w:rPr>
-              <w:t>_pro</w:t>
-            </w:r>
-            <w:r>
-              <w:rPr>
-                <w:rFonts w:ascii="Times New Roman" w:hAnsi="Times New Roman"/>
-                <w:color w:val="000000" w:themeColor="text1"/>
-                <w:sz w:val="14"/>
-                <w:szCs w:val="14"/>
-              </w:rPr>
-              <w:t xml:space="preserve"> }}</w:t>
+              <w:t/>
+            </w:r>
+            <w:r>
+              <w:rPr>
+                <w:rFonts w:ascii="Times New Roman" w:hAnsi="Times New Roman"/>
+                <w:color w:val="000000" w:themeColor="text1"/>
+                <w:sz w:val="14"/>
+                <w:szCs w:val="14"/>
+              </w:rPr>
+              <w:t/>
+            </w:r>
+            <w:r>
+              <w:rPr>
+                <w:rFonts w:ascii="Times New Roman" w:hAnsi="Times New Roman"/>
+                <w:color w:val="000000" w:themeColor="text1"/>
+                <w:sz w:val="14"/>
+                <w:szCs w:val="14"/>
+              </w:rPr>
+              <w:t/>
+            </w:r>
+            <w:r>
+              <w:rPr>
+                <w:rFonts w:ascii="Times New Roman" w:hAnsi="Times New Roman"/>
+                <w:color w:val="000000" w:themeColor="text1"/>
+                <w:sz w:val="14"/>
+                <w:szCs w:val="14"/>
+              </w:rPr>
+              <w:t xml:space="preserve"/>
             </w:r>
           </w:p>
         </w:tc>
@@ -9822,7 +9822,7 @@
                 <w:sz w:val="14"/>
                 <w:szCs w:val="14"/>
               </w:rPr>
-              <w:t xml:space="preserve">{{ </w:t>
+              <w:t xml:space="preserve" w:space="preserve">{{ alq_af_etx_sett_dur_pro }}</w:t>
             </w:r>
             <w:r>
               <w:rPr>
@@ -9832,34 +9832,34 @@
                 <w:szCs w:val="14"/>
                 <w:lang w:eastAsia="zh-CN"/>
               </w:rPr>
-              <w:t>af_</w:t>
-            </w:r>
-            <w:r>
-              <w:rPr>
-                <w:rFonts w:ascii="Times New Roman" w:hAnsi="Times New Roman"/>
-                <w:color w:val="000000" w:themeColor="text1"/>
-                <w:sz w:val="14"/>
-                <w:szCs w:val="14"/>
-              </w:rPr>
-              <w:t>etx_sett_dur</w:t>
-            </w:r>
-            <w:r>
-              <w:rPr>
-                <w:rFonts w:ascii="Times New Roman" w:hAnsi="Times New Roman"/>
-                <w:color w:val="000000" w:themeColor="text1"/>
-                <w:sz w:val="14"/>
-                <w:szCs w:val="14"/>
-              </w:rPr>
-              <w:t>_pro</w:t>
-            </w:r>
-            <w:r>
-              <w:rPr>
-                <w:rFonts w:ascii="Times New Roman" w:hAnsi="Times New Roman"/>
-                <w:color w:val="000000" w:themeColor="text1"/>
-                <w:sz w:val="14"/>
-                <w:szCs w:val="14"/>
-              </w:rPr>
-              <w:t xml:space="preserve"> }}</w:t>
+              <w:t/>
+            </w:r>
+            <w:r>
+              <w:rPr>
+                <w:rFonts w:ascii="Times New Roman" w:hAnsi="Times New Roman"/>
+                <w:color w:val="000000" w:themeColor="text1"/>
+                <w:sz w:val="14"/>
+                <w:szCs w:val="14"/>
+              </w:rPr>
+              <w:t/>
+            </w:r>
+            <w:r>
+              <w:rPr>
+                <w:rFonts w:ascii="Times New Roman" w:hAnsi="Times New Roman"/>
+                <w:color w:val="000000" w:themeColor="text1"/>
+                <w:sz w:val="14"/>
+                <w:szCs w:val="14"/>
+              </w:rPr>
+              <w:t/>
+            </w:r>
+            <w:r>
+              <w:rPr>
+                <w:rFonts w:ascii="Times New Roman" w:hAnsi="Times New Roman"/>
+                <w:color w:val="000000" w:themeColor="text1"/>
+                <w:sz w:val="14"/>
+                <w:szCs w:val="14"/>
+              </w:rPr>
+              <w:t xml:space="preserve"/>
             </w:r>
           </w:p>
         </w:tc>
@@ -9887,7 +9887,7 @@
                 <w:sz w:val="14"/>
                 <w:szCs w:val="14"/>
               </w:rPr>
-              <w:t xml:space="preserve">{{ </w:t>
+              <w:t xml:space="preserve" w:space="preserve">{{ alq_af_id_sett_dur_pro }}</w:t>
             </w:r>
             <w:r>
               <w:rPr>
@@ -9897,34 +9897,34 @@
                 <w:szCs w:val="14"/>
                 <w:lang w:eastAsia="zh-CN"/>
               </w:rPr>
-              <w:t>af_</w:t>
-            </w:r>
-            <w:r>
-              <w:rPr>
-                <w:rFonts w:ascii="Times New Roman" w:hAnsi="Times New Roman"/>
-                <w:color w:val="000000" w:themeColor="text1"/>
-                <w:sz w:val="14"/>
-                <w:szCs w:val="14"/>
-              </w:rPr>
-              <w:t>id_sett_dur</w:t>
-            </w:r>
-            <w:r>
-              <w:rPr>
-                <w:rFonts w:ascii="Times New Roman" w:hAnsi="Times New Roman"/>
-                <w:color w:val="000000" w:themeColor="text1"/>
-                <w:sz w:val="14"/>
-                <w:szCs w:val="14"/>
-              </w:rPr>
-              <w:t>_pro</w:t>
-            </w:r>
-            <w:r>
-              <w:rPr>
-                <w:rFonts w:ascii="Times New Roman" w:hAnsi="Times New Roman"/>
-                <w:color w:val="000000" w:themeColor="text1"/>
-                <w:sz w:val="14"/>
-                <w:szCs w:val="14"/>
-              </w:rPr>
-              <w:t xml:space="preserve"> }}</w:t>
+              <w:t/>
+            </w:r>
+            <w:r>
+              <w:rPr>
+                <w:rFonts w:ascii="Times New Roman" w:hAnsi="Times New Roman"/>
+                <w:color w:val="000000" w:themeColor="text1"/>
+                <w:sz w:val="14"/>
+                <w:szCs w:val="14"/>
+              </w:rPr>
+              <w:t/>
+            </w:r>
+            <w:r>
+              <w:rPr>
+                <w:rFonts w:ascii="Times New Roman" w:hAnsi="Times New Roman"/>
+                <w:color w:val="000000" w:themeColor="text1"/>
+                <w:sz w:val="14"/>
+                <w:szCs w:val="14"/>
+              </w:rPr>
+              <w:t/>
+            </w:r>
+            <w:r>
+              <w:rPr>
+                <w:rFonts w:ascii="Times New Roman" w:hAnsi="Times New Roman"/>
+                <w:color w:val="000000" w:themeColor="text1"/>
+                <w:sz w:val="14"/>
+                <w:szCs w:val="14"/>
+              </w:rPr>
+              <w:t xml:space="preserve"/>
             </w:r>
           </w:p>
         </w:tc>
@@ -10084,7 +10084,7 @@
                 <w:sz w:val="14"/>
                 <w:szCs w:val="14"/>
               </w:rPr>
-              <w:t>{{ date_of_weekly }}</w:t>
+              <w:t w:space="preserve" xml:space="preserve">{{ alq_date_of_weekly }}</w:t>
             </w:r>
           </w:p>
         </w:tc>
@@ -10172,7 +10172,7 @@
                 <w:sz w:val="14"/>
                 <w:szCs w:val="14"/>
               </w:rPr>
-              <w:t>{{ obs_air_wk_of }}</w:t>
+              <w:t w:space="preserve" xml:space="preserve">{{ alq_obs_air_wk_of }}</w:t>
             </w:r>
           </w:p>
         </w:tc>
@@ -10203,7 +10203,7 @@
                 <w:sz w:val="14"/>
                 <w:szCs w:val="14"/>
               </w:rPr>
-              <w:t>{{ etx_air_wk_of }}</w:t>
+              <w:t w:space="preserve" xml:space="preserve">{{ alq_etx_air_wk_of }}</w:t>
             </w:r>
           </w:p>
         </w:tc>
@@ -10235,7 +10235,7 @@
                 <w:sz w:val="14"/>
                 <w:szCs w:val="14"/>
               </w:rPr>
-              <w:t>{{ id_air_wk_of }}</w:t>
+              <w:t w:space="preserve" xml:space="preserve">{{ alq_id_air_wk_of }}</w:t>
             </w:r>
           </w:p>
         </w:tc>
@@ -10355,7 +10355,7 @@
                 <w:sz w:val="14"/>
                 <w:szCs w:val="14"/>
               </w:rPr>
-              <w:t>{{ date_of_weekly }}</w:t>
+              <w:t w:space="preserve" xml:space="preserve">{{ alq_date_of_weekly }}</w:t>
             </w:r>
           </w:p>
         </w:tc>
@@ -10438,7 +10438,7 @@
                 <w:sz w:val="14"/>
                 <w:szCs w:val="14"/>
               </w:rPr>
-              <w:t>{{ obs_air_wk_of }}</w:t>
+              <w:t w:space="preserve" xml:space="preserve">{{ alq_obs_air_wk_of }}</w:t>
             </w:r>
           </w:p>
         </w:tc>
@@ -10469,7 +10469,7 @@
                 <w:sz w:val="14"/>
                 <w:szCs w:val="14"/>
               </w:rPr>
-              <w:t>{{ etx_air_wk_of }}</w:t>
+              <w:t w:space="preserve" xml:space="preserve">{{ alq_etx_air_wk_of }}</w:t>
             </w:r>
           </w:p>
         </w:tc>
@@ -10501,7 +10501,7 @@
                 <w:sz w:val="14"/>
                 <w:szCs w:val="14"/>
               </w:rPr>
-              <w:t>{{ id_air_wk_of }}</w:t>
+              <w:t w:space="preserve" xml:space="preserve">{{ alq_id_air_wk_of }}</w:t>
             </w:r>
           </w:p>
         </w:tc>
@@ -10741,7 +10741,7 @@
                 <w:sz w:val="14"/>
                 <w:szCs w:val="14"/>
               </w:rPr>
-              <w:t>{{ obs_room_wk_of }}</w:t>
+              <w:t w:space="preserve" xml:space="preserve">{{ alq_obs_room_wk_of }}</w:t>
             </w:r>
           </w:p>
         </w:tc>
@@ -10772,7 +10772,7 @@
                 <w:sz w:val="14"/>
                 <w:szCs w:val="14"/>
               </w:rPr>
-              <w:t>{{ etx_room_wk_of }}</w:t>
+              <w:t w:space="preserve" xml:space="preserve">{{ alq_etx_room_wk_of }}</w:t>
             </w:r>
           </w:p>
         </w:tc>
@@ -10804,7 +10804,7 @@
                 <w:sz w:val="14"/>
                 <w:szCs w:val="14"/>
               </w:rPr>
-              <w:t>{{ id_room_wk_of }}</w:t>
+              <w:t w:space="preserve" xml:space="preserve">{{ alq_id_room_wk_of }}</w:t>
             </w:r>
           </w:p>
         </w:tc>
@@ -11007,7 +11007,7 @@
                 <w:sz w:val="14"/>
                 <w:szCs w:val="14"/>
               </w:rPr>
-              <w:t>{{ obs_room_wk_of }}</w:t>
+              <w:t w:space="preserve" xml:space="preserve">{{ alq_obs_room_wk_of }}</w:t>
             </w:r>
           </w:p>
         </w:tc>
@@ -11038,7 +11038,7 @@
                 <w:sz w:val="14"/>
                 <w:szCs w:val="14"/>
               </w:rPr>
-              <w:t>{{ etx_room_wk_of }}</w:t>
+              <w:t w:space="preserve" xml:space="preserve">{{ alq_etx_room_wk_of }}</w:t>
             </w:r>
           </w:p>
         </w:tc>
@@ -11070,7 +11070,7 @@
                 <w:sz w:val="14"/>
                 <w:szCs w:val="14"/>
               </w:rPr>
-              <w:t>{{ id_room_wk_of }}</w:t>
+              <w:t w:space="preserve" xml:space="preserve">{{ alq_id_room_wk_of }}</w:t>
             </w:r>
           </w:p>
         </w:tc>

</xml_diff>